<commit_message>
Update project planning document with MVP screens and technical implementation details
</commit_message>
<xml_diff>
--- a/project_planning.docx
+++ b/project_planning.docx
@@ -40,10 +40,7 @@
         <w:jc w:val="left"/>
       </w:pPr>
       <w:r>
-        <w:t xml:space="preserve">Allow users to know and improve </w:t>
-      </w:r>
-      <w:r>
-        <w:t>flexibility.</w:t>
+        <w:t>Allow users to know and improve flexibility.</w:t>
       </w:r>
     </w:p>
     <w:p>
@@ -111,10 +108,7 @@
         <w:t>Static</w:t>
       </w:r>
       <w:r>
-        <w:t xml:space="preserve"> Flexibility, example: Hamstring stretch - </w:t>
-      </w:r>
-      <w:r>
-        <w:t>Sitting and reaching toward your toes, holding 20–30 seconds.</w:t>
+        <w:t xml:space="preserve"> Flexibility, example: Hamstring stretch - Sitting and reaching toward your toes, holding 20–30 seconds.</w:t>
       </w:r>
     </w:p>
     <w:p>
@@ -129,10 +123,7 @@
         <w:t>Dynamic</w:t>
       </w:r>
       <w:r>
-        <w:t xml:space="preserve"> Flexibility, example: Leg swings - </w:t>
-      </w:r>
-      <w:r>
-        <w:t>Forward/backward or side-to-side.</w:t>
+        <w:t xml:space="preserve"> Flexibility, example: Leg swings - Forward/backward or side-to-side.</w:t>
       </w:r>
     </w:p>
     <w:p>
@@ -147,16 +138,7 @@
         <w:t>Joint</w:t>
       </w:r>
       <w:r>
-        <w:t xml:space="preserve"> Mobility, example: </w:t>
-      </w:r>
-      <w:r>
-        <w:t>Ankle dorsiflexion rocks</w:t>
-      </w:r>
-      <w:r>
-        <w:t xml:space="preserve"> - </w:t>
-      </w:r>
-      <w:r>
-        <w:t>Knee over toes while heel stays down.</w:t>
+        <w:t xml:space="preserve"> Mobility, example: Ankle dorsiflexion rocks - Knee over toes while heel stays down.</w:t>
       </w:r>
     </w:p>
     <w:p>
@@ -174,25 +156,7 @@
         <w:t xml:space="preserve"> Mobility, example: </w:t>
       </w:r>
       <w:r>
-        <w:t>Walking lunges with rotation</w:t>
-      </w:r>
-      <w:r>
-        <w:t xml:space="preserve"> - </w:t>
-      </w:r>
-      <w:r>
-        <w:t xml:space="preserve">Step </w:t>
-      </w:r>
-      <w:r>
-        <w:t>-&gt;</w:t>
-      </w:r>
-      <w:r>
-        <w:t xml:space="preserve"> lunge </w:t>
-      </w:r>
-      <w:r>
-        <w:t>-&gt;</w:t>
-      </w:r>
-      <w:r>
-        <w:t xml:space="preserve"> rotate toward front leg.</w:t>
+        <w:t>Walking lunges with rotation - Step -&gt; lunge -&gt; rotate toward front leg.</w:t>
       </w:r>
     </w:p>
     <w:p>
@@ -808,8 +772,738 @@
         <w:jc w:val="left"/>
       </w:pPr>
       <w:r>
-        <w:t>Example MVP/Screens</w:t>
+        <w:t>Example MVP</w:t>
       </w:r>
+      <w:r>
+        <w:t xml:space="preserve"> </w:t>
+      </w:r>
+      <w:r>
+        <w:t>Screens</w:t>
+      </w:r>
+    </w:p>
+    <w:tbl>
+      <w:tblPr>
+        <w:tblStyle w:val="TableGrid"/>
+        <w:tblW w:w="0" w:type="auto"/>
+        <w:tblLook w:val="04A0" w:firstRow="1" w:lastRow="0" w:firstColumn="1" w:lastColumn="0" w:noHBand="0" w:noVBand="1"/>
+      </w:tblPr>
+      <w:tblGrid>
+        <w:gridCol w:w="2927"/>
+        <w:gridCol w:w="2933"/>
+        <w:gridCol w:w="3166"/>
+      </w:tblGrid>
+      <w:tr>
+        <w:tc>
+          <w:tcPr>
+            <w:tcW w:w="3005" w:type="dxa"/>
+            <w:tcBorders>
+              <w:top w:val="nil"/>
+              <w:left w:val="nil"/>
+            </w:tcBorders>
+          </w:tcPr>
+          <w:p>
+            <w:r>
+              <w:t>Screen</w:t>
+            </w:r>
+          </w:p>
+        </w:tc>
+        <w:tc>
+          <w:tcPr>
+            <w:tcW w:w="3005" w:type="dxa"/>
+            <w:tcBorders>
+              <w:top w:val="nil"/>
+            </w:tcBorders>
+          </w:tcPr>
+          <w:p>
+            <w:r>
+              <w:t>Purpose</w:t>
+            </w:r>
+          </w:p>
+        </w:tc>
+        <w:tc>
+          <w:tcPr>
+            <w:tcW w:w="3006" w:type="dxa"/>
+            <w:tcBorders>
+              <w:top w:val="nil"/>
+              <w:right w:val="nil"/>
+            </w:tcBorders>
+          </w:tcPr>
+          <w:p>
+            <w:r>
+              <w:t>Key elements</w:t>
+            </w:r>
+          </w:p>
+        </w:tc>
+      </w:tr>
+      <w:tr>
+        <w:tc>
+          <w:tcPr>
+            <w:tcW w:w="3005" w:type="dxa"/>
+          </w:tcPr>
+          <w:p>
+            <w:pPr>
+              <w:jc w:val="left"/>
+            </w:pPr>
+            <w:r>
+              <w:t xml:space="preserve">Welcome / </w:t>
+            </w:r>
+            <w:r>
+              <w:t>E</w:t>
+            </w:r>
+            <w:r>
+              <w:t>ntry</w:t>
+            </w:r>
+          </w:p>
+        </w:tc>
+        <w:tc>
+          <w:tcPr>
+            <w:tcW w:w="3005" w:type="dxa"/>
+          </w:tcPr>
+          <w:p>
+            <w:pPr>
+              <w:jc w:val="left"/>
+            </w:pPr>
+            <w:r>
+              <w:t>Explain value without blocking the use</w:t>
+            </w:r>
+          </w:p>
+        </w:tc>
+        <w:tc>
+          <w:tcPr>
+            <w:tcW w:w="3006" w:type="dxa"/>
+          </w:tcPr>
+          <w:p>
+            <w:pPr>
+              <w:jc w:val="left"/>
+            </w:pPr>
+            <w:r>
+              <w:t>Continue as guest, sign in/create account, short explanations</w:t>
+            </w:r>
+          </w:p>
+        </w:tc>
+      </w:tr>
+      <w:tr>
+        <w:tc>
+          <w:tcPr>
+            <w:tcW w:w="3005" w:type="dxa"/>
+          </w:tcPr>
+          <w:p>
+            <w:pPr>
+              <w:jc w:val="left"/>
+            </w:pPr>
+            <w:r>
+              <w:t>Home</w:t>
+            </w:r>
+          </w:p>
+        </w:tc>
+        <w:tc>
+          <w:tcPr>
+            <w:tcW w:w="3005" w:type="dxa"/>
+          </w:tcPr>
+          <w:p>
+            <w:pPr>
+              <w:jc w:val="left"/>
+            </w:pPr>
+            <w:r>
+              <w:t>Fast access to useful actions</w:t>
+            </w:r>
+          </w:p>
+        </w:tc>
+        <w:tc>
+          <w:tcPr>
+            <w:tcW w:w="3006" w:type="dxa"/>
+          </w:tcPr>
+          <w:p>
+            <w:pPr>
+              <w:jc w:val="left"/>
+            </w:pPr>
+          </w:p>
+        </w:tc>
+      </w:tr>
+      <w:tr>
+        <w:tc>
+          <w:tcPr>
+            <w:tcW w:w="3005" w:type="dxa"/>
+          </w:tcPr>
+          <w:p>
+            <w:pPr>
+              <w:jc w:val="left"/>
+            </w:pPr>
+            <w:r>
+              <w:t>Explore</w:t>
+            </w:r>
+          </w:p>
+        </w:tc>
+        <w:tc>
+          <w:tcPr>
+            <w:tcW w:w="3005" w:type="dxa"/>
+          </w:tcPr>
+          <w:p>
+            <w:pPr>
+              <w:jc w:val="left"/>
+            </w:pPr>
+            <w:r>
+              <w:t>Discover content</w:t>
+            </w:r>
+          </w:p>
+        </w:tc>
+        <w:tc>
+          <w:tcPr>
+            <w:tcW w:w="3006" w:type="dxa"/>
+          </w:tcPr>
+          <w:p>
+            <w:pPr>
+              <w:jc w:val="left"/>
+            </w:pPr>
+            <w:r>
+              <w:t>Body area, situation, routine search, exercise search</w:t>
+            </w:r>
+          </w:p>
+        </w:tc>
+      </w:tr>
+      <w:tr>
+        <w:tc>
+          <w:tcPr>
+            <w:tcW w:w="3005" w:type="dxa"/>
+          </w:tcPr>
+          <w:p>
+            <w:pPr>
+              <w:jc w:val="left"/>
+            </w:pPr>
+            <w:r>
+              <w:t>Routine detail</w:t>
+            </w:r>
+          </w:p>
+        </w:tc>
+        <w:tc>
+          <w:tcPr>
+            <w:tcW w:w="3005" w:type="dxa"/>
+          </w:tcPr>
+          <w:p>
+            <w:pPr>
+              <w:jc w:val="left"/>
+            </w:pPr>
+            <w:r>
+              <w:t>Understand what will happen</w:t>
+            </w:r>
+          </w:p>
+        </w:tc>
+        <w:tc>
+          <w:tcPr>
+            <w:tcW w:w="3006" w:type="dxa"/>
+          </w:tcPr>
+          <w:p>
+            <w:pPr>
+              <w:jc w:val="left"/>
+            </w:pPr>
+            <w:r>
+              <w:t>Duration, focus areas, exercise list, equipment, start</w:t>
+            </w:r>
+          </w:p>
+        </w:tc>
+      </w:tr>
+      <w:tr>
+        <w:tc>
+          <w:tcPr>
+            <w:tcW w:w="3005" w:type="dxa"/>
+          </w:tcPr>
+          <w:p>
+            <w:pPr>
+              <w:jc w:val="left"/>
+            </w:pPr>
+            <w:r>
+              <w:t>Session player</w:t>
+            </w:r>
+          </w:p>
+        </w:tc>
+        <w:tc>
+          <w:tcPr>
+            <w:tcW w:w="3005" w:type="dxa"/>
+          </w:tcPr>
+          <w:p>
+            <w:pPr>
+              <w:jc w:val="left"/>
+            </w:pPr>
+            <w:r>
+              <w:t>Perform the routine</w:t>
+            </w:r>
+          </w:p>
+        </w:tc>
+        <w:tc>
+          <w:tcPr>
+            <w:tcW w:w="3006" w:type="dxa"/>
+          </w:tcPr>
+          <w:p>
+            <w:pPr>
+              <w:jc w:val="left"/>
+            </w:pPr>
+            <w:r>
+              <w:t>Controls, timer/reps, demo media, instructions, skip/previous/pause</w:t>
+            </w:r>
+          </w:p>
+        </w:tc>
+      </w:tr>
+      <w:tr>
+        <w:tc>
+          <w:tcPr>
+            <w:tcW w:w="3005" w:type="dxa"/>
+          </w:tcPr>
+          <w:p>
+            <w:pPr>
+              <w:jc w:val="left"/>
+            </w:pPr>
+            <w:r>
+              <w:t>Exercise detail</w:t>
+            </w:r>
+          </w:p>
+        </w:tc>
+        <w:tc>
+          <w:tcPr>
+            <w:tcW w:w="3005" w:type="dxa"/>
+          </w:tcPr>
+          <w:p>
+            <w:pPr>
+              <w:jc w:val="left"/>
+            </w:pPr>
+            <w:r>
+              <w:t>Learn one movement</w:t>
+            </w:r>
+          </w:p>
+        </w:tc>
+        <w:tc>
+          <w:tcPr>
+            <w:tcW w:w="3006" w:type="dxa"/>
+          </w:tcPr>
+          <w:p>
+            <w:pPr>
+              <w:jc w:val="left"/>
+            </w:pPr>
+            <w:r>
+              <w:t>Purpose, steps, common mistakes, easier/harder options, safety notes</w:t>
+            </w:r>
+          </w:p>
+        </w:tc>
+      </w:tr>
+      <w:tr>
+        <w:tc>
+          <w:tcPr>
+            <w:tcW w:w="3005" w:type="dxa"/>
+          </w:tcPr>
+          <w:p>
+            <w:pPr>
+              <w:jc w:val="left"/>
+            </w:pPr>
+            <w:r>
+              <w:t>Feedback</w:t>
+            </w:r>
+          </w:p>
+        </w:tc>
+        <w:tc>
+          <w:tcPr>
+            <w:tcW w:w="3005" w:type="dxa"/>
+          </w:tcPr>
+          <w:p>
+            <w:pPr>
+              <w:jc w:val="left"/>
+            </w:pPr>
+            <w:r>
+              <w:t>Capture simple session response</w:t>
+            </w:r>
+          </w:p>
+        </w:tc>
+        <w:tc>
+          <w:tcPr>
+            <w:tcW w:w="3006" w:type="dxa"/>
+          </w:tcPr>
+          <w:p>
+            <w:pPr>
+              <w:jc w:val="left"/>
+            </w:pPr>
+            <w:r>
+              <w:t>Easy/Good/Difficult/Uncomfortable, optional note</w:t>
+            </w:r>
+          </w:p>
+        </w:tc>
+      </w:tr>
+      <w:tr>
+        <w:tc>
+          <w:tcPr>
+            <w:tcW w:w="3005" w:type="dxa"/>
+          </w:tcPr>
+          <w:p>
+            <w:pPr>
+              <w:jc w:val="left"/>
+            </w:pPr>
+            <w:r>
+              <w:t xml:space="preserve">Progress / </w:t>
+            </w:r>
+            <w:r>
+              <w:t>H</w:t>
+            </w:r>
+            <w:r>
+              <w:t>istory</w:t>
+            </w:r>
+          </w:p>
+        </w:tc>
+        <w:tc>
+          <w:tcPr>
+            <w:tcW w:w="3005" w:type="dxa"/>
+          </w:tcPr>
+          <w:p>
+            <w:pPr>
+              <w:jc w:val="left"/>
+            </w:pPr>
+            <w:r>
+              <w:t>Encourage consistency</w:t>
+            </w:r>
+          </w:p>
+        </w:tc>
+        <w:tc>
+          <w:tcPr>
+            <w:tcW w:w="3006" w:type="dxa"/>
+          </w:tcPr>
+          <w:p>
+            <w:pPr>
+              <w:jc w:val="left"/>
+            </w:pPr>
+            <w:r>
+              <w:t>Recent sessions, minutes, favourite routines, tracking of progression</w:t>
+            </w:r>
+          </w:p>
+        </w:tc>
+      </w:tr>
+      <w:tr>
+        <w:tc>
+          <w:tcPr>
+            <w:tcW w:w="3005" w:type="dxa"/>
+          </w:tcPr>
+          <w:p>
+            <w:pPr>
+              <w:jc w:val="left"/>
+            </w:pPr>
+            <w:r>
+              <w:t xml:space="preserve">Profile / </w:t>
+            </w:r>
+            <w:r>
+              <w:t>S</w:t>
+            </w:r>
+            <w:r>
+              <w:t>ettings</w:t>
+            </w:r>
+          </w:p>
+        </w:tc>
+        <w:tc>
+          <w:tcPr>
+            <w:tcW w:w="3005" w:type="dxa"/>
+          </w:tcPr>
+          <w:p>
+            <w:pPr>
+              <w:jc w:val="left"/>
+            </w:pPr>
+            <w:r>
+              <w:t>Manage personal data and preferences</w:t>
+            </w:r>
+          </w:p>
+        </w:tc>
+        <w:tc>
+          <w:tcPr>
+            <w:tcW w:w="3006" w:type="dxa"/>
+          </w:tcPr>
+          <w:p>
+            <w:pPr>
+              <w:jc w:val="left"/>
+            </w:pPr>
+            <w:r>
+              <w:t>Account, reminders, privacy, safety information</w:t>
+            </w:r>
+          </w:p>
+        </w:tc>
+      </w:tr>
+    </w:tbl>
+    <w:p>
+      <w:pPr>
+        <w:jc w:val="left"/>
+      </w:pPr>
+    </w:p>
+    <w:p>
+      <w:pPr>
+        <w:pStyle w:val="Heading1"/>
+        <w:jc w:val="left"/>
+      </w:pPr>
+      <w:r>
+        <w:lastRenderedPageBreak/>
+        <w:t>Technical Implementation</w:t>
+      </w:r>
+    </w:p>
+    <w:tbl>
+      <w:tblPr>
+        <w:tblStyle w:val="TableGrid"/>
+        <w:tblW w:w="0" w:type="auto"/>
+        <w:tblLook w:val="04A0" w:firstRow="1" w:lastRow="0" w:firstColumn="1" w:lastColumn="0" w:noHBand="0" w:noVBand="1"/>
+      </w:tblPr>
+      <w:tblGrid>
+        <w:gridCol w:w="3005"/>
+        <w:gridCol w:w="3005"/>
+        <w:gridCol w:w="3006"/>
+      </w:tblGrid>
+      <w:tr>
+        <w:tc>
+          <w:tcPr>
+            <w:tcW w:w="3005" w:type="dxa"/>
+            <w:tcBorders>
+              <w:top w:val="nil"/>
+              <w:left w:val="nil"/>
+            </w:tcBorders>
+          </w:tcPr>
+          <w:p>
+            <w:r>
+              <w:t>Layer / Service</w:t>
+            </w:r>
+          </w:p>
+        </w:tc>
+        <w:tc>
+          <w:tcPr>
+            <w:tcW w:w="3005" w:type="dxa"/>
+            <w:tcBorders>
+              <w:top w:val="nil"/>
+            </w:tcBorders>
+          </w:tcPr>
+          <w:p>
+            <w:r>
+              <w:t>Technology</w:t>
+            </w:r>
+          </w:p>
+        </w:tc>
+        <w:tc>
+          <w:tcPr>
+            <w:tcW w:w="3006" w:type="dxa"/>
+            <w:tcBorders>
+              <w:top w:val="nil"/>
+              <w:right w:val="nil"/>
+            </w:tcBorders>
+          </w:tcPr>
+          <w:p>
+            <w:r>
+              <w:t>Responsibility</w:t>
+            </w:r>
+          </w:p>
+        </w:tc>
+      </w:tr>
+      <w:tr>
+        <w:tc>
+          <w:tcPr>
+            <w:tcW w:w="3005" w:type="dxa"/>
+          </w:tcPr>
+          <w:p>
+            <w:pPr>
+              <w:jc w:val="left"/>
+            </w:pPr>
+            <w:r>
+              <w:t>Client</w:t>
+            </w:r>
+          </w:p>
+        </w:tc>
+        <w:tc>
+          <w:tcPr>
+            <w:tcW w:w="3005" w:type="dxa"/>
+          </w:tcPr>
+          <w:p>
+            <w:pPr>
+              <w:jc w:val="left"/>
+            </w:pPr>
+            <w:r>
+              <w:t>Flutter / Dart</w:t>
+            </w:r>
+          </w:p>
+        </w:tc>
+        <w:tc>
+          <w:tcPr>
+            <w:tcW w:w="3006" w:type="dxa"/>
+          </w:tcPr>
+          <w:p>
+            <w:pPr>
+              <w:jc w:val="left"/>
+            </w:pPr>
+            <w:r>
+              <w:t>Android and iOS UI, navigation, local session state and presentation logic</w:t>
+            </w:r>
+          </w:p>
+        </w:tc>
+      </w:tr>
+      <w:tr>
+        <w:tc>
+          <w:tcPr>
+            <w:tcW w:w="3005" w:type="dxa"/>
+          </w:tcPr>
+          <w:p>
+            <w:pPr>
+              <w:jc w:val="left"/>
+            </w:pPr>
+            <w:r>
+              <w:t>Authentication</w:t>
+            </w:r>
+          </w:p>
+        </w:tc>
+        <w:tc>
+          <w:tcPr>
+            <w:tcW w:w="3005" w:type="dxa"/>
+          </w:tcPr>
+          <w:p>
+            <w:pPr>
+              <w:jc w:val="left"/>
+            </w:pPr>
+            <w:r>
+              <w:t>Firebase Authentication</w:t>
+            </w:r>
+          </w:p>
+        </w:tc>
+        <w:tc>
+          <w:tcPr>
+            <w:tcW w:w="3006" w:type="dxa"/>
+          </w:tcPr>
+          <w:p>
+            <w:pPr>
+              <w:jc w:val="left"/>
+            </w:pPr>
+            <w:r>
+              <w:t>Accounts and cross-device identity</w:t>
+            </w:r>
+          </w:p>
+        </w:tc>
+      </w:tr>
+      <w:tr>
+        <w:tc>
+          <w:tcPr>
+            <w:tcW w:w="3005" w:type="dxa"/>
+          </w:tcPr>
+          <w:p>
+            <w:pPr>
+              <w:jc w:val="left"/>
+            </w:pPr>
+            <w:r>
+              <w:t>Database</w:t>
+            </w:r>
+          </w:p>
+        </w:tc>
+        <w:tc>
+          <w:tcPr>
+            <w:tcW w:w="3005" w:type="dxa"/>
+          </w:tcPr>
+          <w:p>
+            <w:pPr>
+              <w:jc w:val="left"/>
+            </w:pPr>
+            <w:r>
+              <w:t xml:space="preserve">Firebase Realtime Database or Cloud </w:t>
+            </w:r>
+            <w:proofErr w:type="spellStart"/>
+            <w:r>
+              <w:t>Firestore</w:t>
+            </w:r>
+            <w:proofErr w:type="spellEnd"/>
+          </w:p>
+        </w:tc>
+        <w:tc>
+          <w:tcPr>
+            <w:tcW w:w="3006" w:type="dxa"/>
+          </w:tcPr>
+          <w:p>
+            <w:pPr>
+              <w:jc w:val="left"/>
+            </w:pPr>
+            <w:r>
+              <w:t>Exercise catalogue, profiles, favourites, session, plans and progress</w:t>
+            </w:r>
+          </w:p>
+        </w:tc>
+      </w:tr>
+      <w:tr>
+        <w:tc>
+          <w:tcPr>
+            <w:tcW w:w="3005" w:type="dxa"/>
+          </w:tcPr>
+          <w:p>
+            <w:pPr>
+              <w:jc w:val="left"/>
+            </w:pPr>
+            <w:r>
+              <w:t>Media</w:t>
+            </w:r>
+          </w:p>
+        </w:tc>
+        <w:tc>
+          <w:tcPr>
+            <w:tcW w:w="3005" w:type="dxa"/>
+          </w:tcPr>
+          <w:p>
+            <w:pPr>
+              <w:jc w:val="left"/>
+            </w:pPr>
+            <w:r>
+              <w:t>Store in app or Firebase Storage</w:t>
+            </w:r>
+          </w:p>
+        </w:tc>
+        <w:tc>
+          <w:tcPr>
+            <w:tcW w:w="3006" w:type="dxa"/>
+          </w:tcPr>
+          <w:p>
+            <w:pPr>
+              <w:jc w:val="left"/>
+            </w:pPr>
+            <w:r>
+              <w:t xml:space="preserve">Exercise images/videos </w:t>
+            </w:r>
+          </w:p>
+        </w:tc>
+      </w:tr>
+      <w:tr>
+        <w:tc>
+          <w:tcPr>
+            <w:tcW w:w="3005" w:type="dxa"/>
+          </w:tcPr>
+          <w:p>
+            <w:pPr>
+              <w:jc w:val="left"/>
+            </w:pPr>
+            <w:r>
+              <w:t>Quality / Operations</w:t>
+            </w:r>
+          </w:p>
+        </w:tc>
+        <w:tc>
+          <w:tcPr>
+            <w:tcW w:w="3005" w:type="dxa"/>
+          </w:tcPr>
+          <w:p>
+            <w:pPr>
+              <w:jc w:val="left"/>
+            </w:pPr>
+            <w:r>
+              <w:t>Firebase Crashlytics + Analytics</w:t>
+            </w:r>
+          </w:p>
+        </w:tc>
+        <w:tc>
+          <w:tcPr>
+            <w:tcW w:w="3006" w:type="dxa"/>
+          </w:tcPr>
+          <w:p>
+            <w:pPr>
+              <w:jc w:val="left"/>
+            </w:pPr>
+            <w:r>
+              <w:t>Crash reporting and product usage signals</w:t>
+            </w:r>
+          </w:p>
+        </w:tc>
+      </w:tr>
+    </w:tbl>
+    <w:p>
+      <w:pPr>
+        <w:jc w:val="left"/>
+      </w:pPr>
     </w:p>
     <w:sectPr>
       <w:pgSz w:w="11906" w:h="16838"/>

</xml_diff>

<commit_message>
Updated project planning to include target users & user needs, example navigation, example first use flow and upcoming headings
</commit_message>
<xml_diff>
--- a/project_planning.docx
+++ b/project_planning.docx
@@ -161,6 +161,470 @@
     </w:p>
     <w:p>
       <w:pPr>
+        <w:pStyle w:val="Heading1"/>
+        <w:jc w:val="left"/>
+      </w:pPr>
+      <w:r>
+        <w:t>Target Users &amp; User Needs</w:t>
+      </w:r>
+    </w:p>
+    <w:tbl>
+      <w:tblPr>
+        <w:tblStyle w:val="TableGrid"/>
+        <w:tblW w:w="0" w:type="auto"/>
+        <w:tblLook w:val="04A0" w:firstRow="1" w:lastRow="0" w:firstColumn="1" w:lastColumn="0" w:noHBand="0" w:noVBand="1"/>
+      </w:tblPr>
+      <w:tblGrid>
+        <w:gridCol w:w="3005"/>
+        <w:gridCol w:w="3005"/>
+        <w:gridCol w:w="3006"/>
+      </w:tblGrid>
+      <w:tr>
+        <w:tc>
+          <w:tcPr>
+            <w:tcW w:w="3005" w:type="dxa"/>
+            <w:tcBorders>
+              <w:top w:val="nil"/>
+              <w:left w:val="nil"/>
+            </w:tcBorders>
+          </w:tcPr>
+          <w:p>
+            <w:r>
+              <w:t>User type</w:t>
+            </w:r>
+          </w:p>
+        </w:tc>
+        <w:tc>
+          <w:tcPr>
+            <w:tcW w:w="3005" w:type="dxa"/>
+            <w:tcBorders>
+              <w:top w:val="nil"/>
+            </w:tcBorders>
+          </w:tcPr>
+          <w:p>
+            <w:r>
+              <w:t>Typical thought</w:t>
+            </w:r>
+          </w:p>
+        </w:tc>
+        <w:tc>
+          <w:tcPr>
+            <w:tcW w:w="3006" w:type="dxa"/>
+            <w:tcBorders>
+              <w:top w:val="nil"/>
+              <w:right w:val="nil"/>
+            </w:tcBorders>
+          </w:tcPr>
+          <w:p>
+            <w:r>
+              <w:t>What the app should do</w:t>
+            </w:r>
+          </w:p>
+        </w:tc>
+      </w:tr>
+      <w:tr>
+        <w:tc>
+          <w:tcPr>
+            <w:tcW w:w="3005" w:type="dxa"/>
+          </w:tcPr>
+          <w:p>
+            <w:pPr>
+              <w:jc w:val="both"/>
+            </w:pPr>
+            <w:r>
+              <w:t>Quick use user</w:t>
+            </w:r>
+          </w:p>
+        </w:tc>
+        <w:tc>
+          <w:tcPr>
+            <w:tcW w:w="3005" w:type="dxa"/>
+          </w:tcPr>
+          <w:p>
+            <w:pPr>
+              <w:jc w:val="both"/>
+            </w:pPr>
+            <w:r>
+              <w:t>“My hips feel stiff. I just want something now”</w:t>
+            </w:r>
+          </w:p>
+        </w:tc>
+        <w:tc>
+          <w:tcPr>
+            <w:tcW w:w="3006" w:type="dxa"/>
+          </w:tcPr>
+          <w:p>
+            <w:pPr>
+              <w:jc w:val="both"/>
+            </w:pPr>
+            <w:r>
+              <w:t>Offer body area and quick duration routes in a few taps</w:t>
+            </w:r>
+          </w:p>
+        </w:tc>
+      </w:tr>
+      <w:tr>
+        <w:tc>
+          <w:tcPr>
+            <w:tcW w:w="3005" w:type="dxa"/>
+          </w:tcPr>
+          <w:p>
+            <w:pPr>
+              <w:jc w:val="both"/>
+            </w:pPr>
+            <w:r>
+              <w:t>Unsure user</w:t>
+            </w:r>
+          </w:p>
+        </w:tc>
+        <w:tc>
+          <w:tcPr>
+            <w:tcW w:w="3005" w:type="dxa"/>
+          </w:tcPr>
+          <w:p>
+            <w:pPr>
+              <w:jc w:val="both"/>
+            </w:pPr>
+            <w:r>
+              <w:t>“I feel stiff but I do not know what I need”</w:t>
+            </w:r>
+          </w:p>
+        </w:tc>
+        <w:tc>
+          <w:tcPr>
+            <w:tcW w:w="3006" w:type="dxa"/>
+          </w:tcPr>
+          <w:p>
+            <w:pPr>
+              <w:jc w:val="both"/>
+            </w:pPr>
+            <w:r>
+              <w:t>Offer situations, movement goals, full body routines and help me choose</w:t>
+            </w:r>
+          </w:p>
+        </w:tc>
+      </w:tr>
+      <w:tr>
+        <w:tc>
+          <w:tcPr>
+            <w:tcW w:w="3005" w:type="dxa"/>
+          </w:tcPr>
+          <w:p>
+            <w:pPr>
+              <w:jc w:val="both"/>
+            </w:pPr>
+            <w:r>
+              <w:t>Training focused user</w:t>
+            </w:r>
+          </w:p>
+        </w:tc>
+        <w:tc>
+          <w:tcPr>
+            <w:tcW w:w="3005" w:type="dxa"/>
+          </w:tcPr>
+          <w:p>
+            <w:pPr>
+              <w:jc w:val="both"/>
+            </w:pPr>
+            <w:r>
+              <w:t>“I want better squat or overhead mobility”</w:t>
+            </w:r>
+          </w:p>
+        </w:tc>
+        <w:tc>
+          <w:tcPr>
+            <w:tcW w:w="3006" w:type="dxa"/>
+          </w:tcPr>
+          <w:p>
+            <w:pPr>
+              <w:jc w:val="both"/>
+            </w:pPr>
+            <w:r>
+              <w:t>Provide goal specific routines spanning relevant areas</w:t>
+            </w:r>
+          </w:p>
+        </w:tc>
+      </w:tr>
+      <w:tr>
+        <w:tc>
+          <w:tcPr>
+            <w:tcW w:w="3005" w:type="dxa"/>
+          </w:tcPr>
+          <w:p>
+            <w:pPr>
+              <w:jc w:val="both"/>
+            </w:pPr>
+            <w:r>
+              <w:t>Structured user</w:t>
+            </w:r>
+          </w:p>
+        </w:tc>
+        <w:tc>
+          <w:tcPr>
+            <w:tcW w:w="3005" w:type="dxa"/>
+          </w:tcPr>
+          <w:p>
+            <w:pPr>
+              <w:jc w:val="both"/>
+            </w:pPr>
+            <w:r>
+              <w:t>“I want to improve over several weeks”</w:t>
+            </w:r>
+          </w:p>
+        </w:tc>
+        <w:tc>
+          <w:tcPr>
+            <w:tcW w:w="3006" w:type="dxa"/>
+          </w:tcPr>
+          <w:p>
+            <w:pPr>
+              <w:jc w:val="both"/>
+            </w:pPr>
+            <w:r>
+              <w:t>Offer a personal programme, progression, history and optional reassessment</w:t>
+            </w:r>
+          </w:p>
+        </w:tc>
+      </w:tr>
+      <w:tr>
+        <w:tc>
+          <w:tcPr>
+            <w:tcW w:w="3005" w:type="dxa"/>
+          </w:tcPr>
+          <w:p>
+            <w:pPr>
+              <w:jc w:val="both"/>
+            </w:pPr>
+            <w:r>
+              <w:t>Explorer</w:t>
+            </w:r>
+          </w:p>
+        </w:tc>
+        <w:tc>
+          <w:tcPr>
+            <w:tcW w:w="3005" w:type="dxa"/>
+          </w:tcPr>
+          <w:p>
+            <w:pPr>
+              <w:jc w:val="both"/>
+            </w:pPr>
+            <w:r>
+              <w:t>“I want to learn individual stretches”</w:t>
+            </w:r>
+          </w:p>
+        </w:tc>
+        <w:tc>
+          <w:tcPr>
+            <w:tcW w:w="3006" w:type="dxa"/>
+          </w:tcPr>
+          <w:p>
+            <w:pPr>
+              <w:jc w:val="both"/>
+            </w:pPr>
+            <w:r>
+              <w:t>Provide a searchable exercise library with clear instructions and education</w:t>
+            </w:r>
+          </w:p>
+        </w:tc>
+      </w:tr>
+    </w:tbl>
+    <w:p>
+      <w:pPr>
+        <w:jc w:val="both"/>
+      </w:pPr>
+    </w:p>
+    <w:p>
+      <w:pPr>
+        <w:pStyle w:val="Heading1"/>
+        <w:jc w:val="left"/>
+      </w:pPr>
+      <w:r>
+        <w:t>Example Navigation</w:t>
+      </w:r>
+    </w:p>
+    <w:tbl>
+      <w:tblPr>
+        <w:tblStyle w:val="TableGrid"/>
+        <w:tblW w:w="0" w:type="auto"/>
+        <w:tblLook w:val="04A0" w:firstRow="1" w:lastRow="0" w:firstColumn="1" w:lastColumn="0" w:noHBand="0" w:noVBand="1"/>
+      </w:tblPr>
+      <w:tblGrid>
+        <w:gridCol w:w="4508"/>
+        <w:gridCol w:w="4508"/>
+      </w:tblGrid>
+      <w:tr>
+        <w:tc>
+          <w:tcPr>
+            <w:tcW w:w="4508" w:type="dxa"/>
+            <w:tcBorders>
+              <w:top w:val="nil"/>
+              <w:left w:val="nil"/>
+            </w:tcBorders>
+          </w:tcPr>
+          <w:p>
+            <w:r>
+              <w:t>Section</w:t>
+            </w:r>
+          </w:p>
+        </w:tc>
+        <w:tc>
+          <w:tcPr>
+            <w:tcW w:w="4508" w:type="dxa"/>
+            <w:tcBorders>
+              <w:top w:val="nil"/>
+              <w:right w:val="nil"/>
+            </w:tcBorders>
+          </w:tcPr>
+          <w:p>
+            <w:r>
+              <w:t>Purpose</w:t>
+            </w:r>
+          </w:p>
+        </w:tc>
+      </w:tr>
+      <w:tr>
+        <w:tc>
+          <w:tcPr>
+            <w:tcW w:w="4508" w:type="dxa"/>
+          </w:tcPr>
+          <w:p>
+            <w:pPr>
+              <w:jc w:val="left"/>
+            </w:pPr>
+            <w:r>
+              <w:t>Home</w:t>
+            </w:r>
+          </w:p>
+        </w:tc>
+        <w:tc>
+          <w:tcPr>
+            <w:tcW w:w="4508" w:type="dxa"/>
+          </w:tcPr>
+          <w:p>
+            <w:pPr>
+              <w:jc w:val="left"/>
+            </w:pPr>
+            <w:r>
+              <w:t>Start quickly, show quick sessions, recent routines and a personal recommendation when available</w:t>
+            </w:r>
+          </w:p>
+        </w:tc>
+      </w:tr>
+      <w:tr>
+        <w:tc>
+          <w:tcPr>
+            <w:tcW w:w="4508" w:type="dxa"/>
+          </w:tcPr>
+          <w:p>
+            <w:pPr>
+              <w:jc w:val="left"/>
+            </w:pPr>
+            <w:r>
+              <w:t>Explore</w:t>
+            </w:r>
+          </w:p>
+        </w:tc>
+        <w:tc>
+          <w:tcPr>
+            <w:tcW w:w="4508" w:type="dxa"/>
+          </w:tcPr>
+          <w:p>
+            <w:pPr>
+              <w:jc w:val="left"/>
+            </w:pPr>
+            <w:r>
+              <w:t>Browse by body area, goal situation, routine or individual exercise</w:t>
+            </w:r>
+          </w:p>
+        </w:tc>
+      </w:tr>
+      <w:tr>
+        <w:tc>
+          <w:tcPr>
+            <w:tcW w:w="4508" w:type="dxa"/>
+          </w:tcPr>
+          <w:p>
+            <w:pPr>
+              <w:jc w:val="left"/>
+            </w:pPr>
+            <w:r>
+              <w:t>Programme</w:t>
+            </w:r>
+          </w:p>
+        </w:tc>
+        <w:tc>
+          <w:tcPr>
+            <w:tcW w:w="4508" w:type="dxa"/>
+          </w:tcPr>
+          <w:p>
+            <w:pPr>
+              <w:jc w:val="left"/>
+            </w:pPr>
+            <w:r>
+              <w:t>Structured personal plan for users who want more guidance</w:t>
+            </w:r>
+          </w:p>
+        </w:tc>
+      </w:tr>
+      <w:tr>
+        <w:tc>
+          <w:tcPr>
+            <w:tcW w:w="4508" w:type="dxa"/>
+          </w:tcPr>
+          <w:p>
+            <w:pPr>
+              <w:jc w:val="left"/>
+            </w:pPr>
+            <w:r>
+              <w:t>Progress</w:t>
+            </w:r>
+          </w:p>
+        </w:tc>
+        <w:tc>
+          <w:tcPr>
+            <w:tcW w:w="4508" w:type="dxa"/>
+          </w:tcPr>
+          <w:p>
+            <w:pPr>
+              <w:jc w:val="left"/>
+            </w:pPr>
+            <w:r>
+              <w:t>Session history, consistency, favourites and later mobility trends</w:t>
+            </w:r>
+          </w:p>
+        </w:tc>
+      </w:tr>
+      <w:tr>
+        <w:tc>
+          <w:tcPr>
+            <w:tcW w:w="4508" w:type="dxa"/>
+          </w:tcPr>
+          <w:p>
+            <w:pPr>
+              <w:jc w:val="left"/>
+            </w:pPr>
+            <w:r>
+              <w:t>Profile / Settings</w:t>
+            </w:r>
+          </w:p>
+        </w:tc>
+        <w:tc>
+          <w:tcPr>
+            <w:tcW w:w="4508" w:type="dxa"/>
+          </w:tcPr>
+          <w:p>
+            <w:pPr>
+              <w:jc w:val="left"/>
+            </w:pPr>
+            <w:r>
+              <w:t>Preferences, reminders, account, safety information and data controls</w:t>
+            </w:r>
+          </w:p>
+        </w:tc>
+      </w:tr>
+    </w:tbl>
+    <w:p>
+      <w:pPr>
         <w:jc w:val="left"/>
       </w:pPr>
     </w:p>
@@ -176,6 +640,124 @@
         <w:rPr>
           <w:noProof w:val="0"/>
         </w:rPr>
+        <w:t>Example First Use Flow</w:t>
+      </w:r>
+    </w:p>
+    <w:p>
+      <w:pPr>
+        <w:jc w:val="left"/>
+      </w:pPr>
+      <w:r>
+        <w:t xml:space="preserve">Open </w:t>
+      </w:r>
+      <w:r>
+        <w:t>app -&gt; Choose how to start -&gt; Start useful content -&gt; Complete session -&gt; Optional feedback -&gt; Personalise later</w:t>
+      </w:r>
+    </w:p>
+    <w:p>
+      <w:pPr>
+        <w:pStyle w:val="ListParagraph"/>
+        <w:numPr>
+          <w:ilvl w:val="0"/>
+          <w:numId w:val="22"/>
+        </w:numPr>
+        <w:jc w:val="left"/>
+      </w:pPr>
+      <w:r>
+        <w:t>A lightweight welcome screen explaining the app in 1 or 2 sentences</w:t>
+      </w:r>
+    </w:p>
+    <w:p>
+      <w:pPr>
+        <w:pStyle w:val="ListParagraph"/>
+        <w:numPr>
+          <w:ilvl w:val="0"/>
+          <w:numId w:val="22"/>
+        </w:numPr>
+        <w:jc w:val="left"/>
+      </w:pPr>
+      <w:r>
+        <w:t>Allow user to continue as a guest or create/sign into an account – account creation should not be required simply to browse</w:t>
+      </w:r>
+    </w:p>
+    <w:p>
+      <w:pPr>
+        <w:pStyle w:val="ListParagraph"/>
+        <w:numPr>
+          <w:ilvl w:val="0"/>
+          <w:numId w:val="22"/>
+        </w:numPr>
+        <w:jc w:val="left"/>
+      </w:pPr>
+      <w:r>
+        <w:t>Offer 3 paths: “I know what I want”, “Help me choose” and “Explore”</w:t>
+      </w:r>
+    </w:p>
+    <w:p>
+      <w:pPr>
+        <w:pStyle w:val="ListParagraph"/>
+        <w:numPr>
+          <w:ilvl w:val="0"/>
+          <w:numId w:val="22"/>
+        </w:numPr>
+        <w:jc w:val="left"/>
+      </w:pPr>
+      <w:r>
+        <w:t>User can choose body area, goal, situation or quick full body routine</w:t>
+      </w:r>
+    </w:p>
+    <w:p>
+      <w:pPr>
+        <w:pStyle w:val="ListParagraph"/>
+        <w:numPr>
+          <w:ilvl w:val="0"/>
+          <w:numId w:val="22"/>
+        </w:numPr>
+        <w:jc w:val="left"/>
+      </w:pPr>
+      <w:r>
+        <w:t>Ask session duration only when it changes the result (example 5, 10, 15 or 20+ minute)</w:t>
+      </w:r>
+    </w:p>
+    <w:p>
+      <w:pPr>
+        <w:pStyle w:val="ListParagraph"/>
+        <w:numPr>
+          <w:ilvl w:val="0"/>
+          <w:numId w:val="22"/>
+        </w:numPr>
+        <w:jc w:val="left"/>
+      </w:pPr>
+      <w:r>
+        <w:t>After session, ask for feedback such as Easy / Good / Difficult / Uncomfortable</w:t>
+      </w:r>
+    </w:p>
+    <w:p>
+      <w:pPr>
+        <w:pStyle w:val="ListParagraph"/>
+        <w:numPr>
+          <w:ilvl w:val="0"/>
+          <w:numId w:val="22"/>
+        </w:numPr>
+        <w:jc w:val="left"/>
+      </w:pPr>
+      <w:r>
+        <w:t>After value has been demonstrated, invite user to create a profile or personalise future recommendations</w:t>
+      </w:r>
+    </w:p>
+    <w:p>
+      <w:pPr>
+        <w:pStyle w:val="Heading1"/>
+        <w:jc w:val="left"/>
+        <w:rPr>
+          <w:noProof w:val="0"/>
+        </w:rPr>
+      </w:pPr>
+      <w:r>
+        <w:rPr>
+          <w:noProof w:val="0"/>
+        </w:rPr>
+        <w:lastRenderedPageBreak/>
         <w:t>Brainstorming The Application</w:t>
       </w:r>
     </w:p>
@@ -1231,7 +1813,6 @@
         <w:jc w:val="left"/>
       </w:pPr>
       <w:r>
-        <w:lastRenderedPageBreak/>
         <w:t>Technical Implementation</w:t>
       </w:r>
     </w:p>
@@ -1394,13 +1975,8 @@
               <w:jc w:val="left"/>
             </w:pPr>
             <w:r>
-              <w:t xml:space="preserve">Firebase Realtime Database or Cloud </w:t>
-            </w:r>
-            <w:proofErr w:type="spellStart"/>
-            <w:r>
-              <w:t>Firestore</w:t>
-            </w:r>
-            <w:proofErr w:type="spellEnd"/>
+              <w:t>Firebase Realtime Database or Cloud Firestore</w:t>
+            </w:r>
           </w:p>
         </w:tc>
         <w:tc>
@@ -1502,8 +2078,52 @@
     </w:tbl>
     <w:p>
       <w:pPr>
-        <w:jc w:val="left"/>
-      </w:pPr>
+        <w:pStyle w:val="Heading1"/>
+      </w:pPr>
+      <w:r>
+        <w:lastRenderedPageBreak/>
+        <w:t>Flutter Project Structure</w:t>
+      </w:r>
+    </w:p>
+    <w:p>
+      <w:pPr>
+        <w:pStyle w:val="Heading1"/>
+      </w:pPr>
+      <w:r>
+        <w:t>Data Model</w:t>
+      </w:r>
+    </w:p>
+    <w:p>
+      <w:pPr>
+        <w:pStyle w:val="Heading1"/>
+      </w:pPr>
+      <w:r>
+        <w:t>Personalisation, Recommendations &amp; Assessment</w:t>
+      </w:r>
+    </w:p>
+    <w:p>
+      <w:pPr>
+        <w:pStyle w:val="Heading1"/>
+      </w:pPr>
+      <w:r>
+        <w:t>Development &amp; Implementation Best Practices</w:t>
+      </w:r>
+    </w:p>
+    <w:p>
+      <w:pPr>
+        <w:pStyle w:val="Heading1"/>
+      </w:pPr>
+      <w:r>
+        <w:t>Testing Stragety</w:t>
+      </w:r>
+    </w:p>
+    <w:p>
+      <w:pPr>
+        <w:pStyle w:val="Heading1"/>
+      </w:pPr>
+      <w:r>
+        <w:t>CI/CD, Deployment &amp; Operations</w:t>
+      </w:r>
     </w:p>
     <w:sectPr>
       <w:pgSz w:w="11906" w:h="16838"/>
@@ -2446,6 +3066,95 @@
         <w:sz w:val="16"/>
         <w:szCs w:val="16"/>
       </w:rPr>
+    </w:lvl>
+  </w:abstractNum>
+  <w:abstractNum w:abstractNumId="8" w15:restartNumberingAfterBreak="0">
+    <w:nsid w:val="7283502C"/>
+    <w:multiLevelType w:val="hybridMultilevel"/>
+    <w:tmpl w:val="AA9A7D5C"/>
+    <w:lvl w:ilvl="0" w:tplc="0809000F">
+      <w:start w:val="1"/>
+      <w:numFmt w:val="decimal"/>
+      <w:lvlText w:val="%1."/>
+      <w:lvlJc w:val="left"/>
+      <w:pPr>
+        <w:ind w:left="720" w:hanging="360"/>
+      </w:pPr>
+      <w:rPr>
+        <w:rFonts w:hint="default"/>
+      </w:rPr>
+    </w:lvl>
+    <w:lvl w:ilvl="1" w:tplc="08090019" w:tentative="1">
+      <w:start w:val="1"/>
+      <w:numFmt w:val="lowerLetter"/>
+      <w:lvlText w:val="%2."/>
+      <w:lvlJc w:val="left"/>
+      <w:pPr>
+        <w:ind w:left="1440" w:hanging="360"/>
+      </w:pPr>
+    </w:lvl>
+    <w:lvl w:ilvl="2" w:tplc="0809001B" w:tentative="1">
+      <w:start w:val="1"/>
+      <w:numFmt w:val="lowerRoman"/>
+      <w:lvlText w:val="%3."/>
+      <w:lvlJc w:val="right"/>
+      <w:pPr>
+        <w:ind w:left="2160" w:hanging="180"/>
+      </w:pPr>
+    </w:lvl>
+    <w:lvl w:ilvl="3" w:tplc="0809000F" w:tentative="1">
+      <w:start w:val="1"/>
+      <w:numFmt w:val="decimal"/>
+      <w:lvlText w:val="%4."/>
+      <w:lvlJc w:val="left"/>
+      <w:pPr>
+        <w:ind w:left="2880" w:hanging="360"/>
+      </w:pPr>
+    </w:lvl>
+    <w:lvl w:ilvl="4" w:tplc="08090019" w:tentative="1">
+      <w:start w:val="1"/>
+      <w:numFmt w:val="lowerLetter"/>
+      <w:lvlText w:val="%5."/>
+      <w:lvlJc w:val="left"/>
+      <w:pPr>
+        <w:ind w:left="3600" w:hanging="360"/>
+      </w:pPr>
+    </w:lvl>
+    <w:lvl w:ilvl="5" w:tplc="0809001B" w:tentative="1">
+      <w:start w:val="1"/>
+      <w:numFmt w:val="lowerRoman"/>
+      <w:lvlText w:val="%6."/>
+      <w:lvlJc w:val="right"/>
+      <w:pPr>
+        <w:ind w:left="4320" w:hanging="180"/>
+      </w:pPr>
+    </w:lvl>
+    <w:lvl w:ilvl="6" w:tplc="0809000F" w:tentative="1">
+      <w:start w:val="1"/>
+      <w:numFmt w:val="decimal"/>
+      <w:lvlText w:val="%7."/>
+      <w:lvlJc w:val="left"/>
+      <w:pPr>
+        <w:ind w:left="5040" w:hanging="360"/>
+      </w:pPr>
+    </w:lvl>
+    <w:lvl w:ilvl="7" w:tplc="08090019" w:tentative="1">
+      <w:start w:val="1"/>
+      <w:numFmt w:val="lowerLetter"/>
+      <w:lvlText w:val="%8."/>
+      <w:lvlJc w:val="left"/>
+      <w:pPr>
+        <w:ind w:left="5760" w:hanging="360"/>
+      </w:pPr>
+    </w:lvl>
+    <w:lvl w:ilvl="8" w:tplc="0809001B" w:tentative="1">
+      <w:start w:val="1"/>
+      <w:numFmt w:val="lowerRoman"/>
+      <w:lvlText w:val="%9."/>
+      <w:lvlJc w:val="right"/>
+      <w:pPr>
+        <w:ind w:left="6480" w:hanging="180"/>
+      </w:pPr>
     </w:lvl>
   </w:abstractNum>
   <w:num w:numId="1" w16cid:durableId="1508641836">
@@ -2510,6 +3219,9 @@
   </w:num>
   <w:num w:numId="21" w16cid:durableId="1676804477">
     <w:abstractNumId w:val="5"/>
+  </w:num>
+  <w:num w:numId="22" w16cid:durableId="1373731249">
+    <w:abstractNumId w:val="8"/>
   </w:num>
 </w:numbering>
 </file>
@@ -3131,6 +3843,7 @@
   <w:style w:type="character" w:default="1" w:styleId="DefaultParagraphFont">
     <w:name w:val="Default Paragraph Font"/>
     <w:uiPriority w:val="1"/>
+    <w:semiHidden/>
     <w:unhideWhenUsed/>
   </w:style>
   <w:style w:type="table" w:default="1" w:styleId="TableNormal">

</xml_diff>

<commit_message>
Updated project planning document with detailed data model and testing strategy examples
</commit_message>
<xml_diff>
--- a/project_planning.docx
+++ b/project_planning.docx
@@ -14,7 +14,7 @@
         <w:rPr>
           <w:noProof w:val="0"/>
         </w:rPr>
-        <w:t>App Concept</w:t>
+        <w:t>Concept</w:t>
       </w:r>
     </w:p>
     <w:p>
@@ -286,7 +286,15 @@
               <w:jc w:val="both"/>
             </w:pPr>
             <w:r>
-              <w:t>“I feel stiff but I do not know what I need”</w:t>
+              <w:t xml:space="preserve">“I feel </w:t>
+            </w:r>
+            <w:proofErr w:type="gramStart"/>
+            <w:r>
+              <w:t>stiff</w:t>
+            </w:r>
+            <w:proofErr w:type="gramEnd"/>
+            <w:r>
+              <w:t xml:space="preserve"> but I do not know what I need”</w:t>
             </w:r>
           </w:p>
         </w:tc>
@@ -1975,8 +1983,13 @@
               <w:jc w:val="left"/>
             </w:pPr>
             <w:r>
-              <w:t>Firebase Realtime Database or Cloud Firestore</w:t>
-            </w:r>
+              <w:t xml:space="preserve">Firebase Realtime Database or Cloud </w:t>
+            </w:r>
+            <w:proofErr w:type="spellStart"/>
+            <w:r>
+              <w:t>Firestore</w:t>
+            </w:r>
+            <w:proofErr w:type="spellEnd"/>
           </w:p>
         </w:tc>
         <w:tc>
@@ -2088,33 +2101,997 @@
     <w:p>
       <w:pPr>
         <w:pStyle w:val="Heading1"/>
-      </w:pPr>
+        <w:jc w:val="left"/>
+      </w:pPr>
+      <w:r>
+        <w:t xml:space="preserve">Example </w:t>
+      </w:r>
       <w:r>
         <w:t>Data Model</w:t>
+      </w:r>
+    </w:p>
+    <w:tbl>
+      <w:tblPr>
+        <w:tblStyle w:val="TableGrid"/>
+        <w:tblW w:w="0" w:type="auto"/>
+        <w:tblLook w:val="04A0" w:firstRow="1" w:lastRow="0" w:firstColumn="1" w:lastColumn="0" w:noHBand="0" w:noVBand="1"/>
+      </w:tblPr>
+      <w:tblGrid>
+        <w:gridCol w:w="4508"/>
+        <w:gridCol w:w="4508"/>
+      </w:tblGrid>
+      <w:tr>
+        <w:tc>
+          <w:tcPr>
+            <w:tcW w:w="4508" w:type="dxa"/>
+          </w:tcPr>
+          <w:p>
+            <w:r>
+              <w:t>Entity</w:t>
+            </w:r>
+          </w:p>
+        </w:tc>
+        <w:tc>
+          <w:tcPr>
+            <w:tcW w:w="4508" w:type="dxa"/>
+          </w:tcPr>
+          <w:p>
+            <w:r>
+              <w:t>Important fields/relationships</w:t>
+            </w:r>
+          </w:p>
+        </w:tc>
+      </w:tr>
+      <w:tr>
+        <w:tc>
+          <w:tcPr>
+            <w:tcW w:w="4508" w:type="dxa"/>
+          </w:tcPr>
+          <w:p>
+            <w:pPr>
+              <w:jc w:val="left"/>
+            </w:pPr>
+            <w:r>
+              <w:t>users</w:t>
+            </w:r>
+          </w:p>
+        </w:tc>
+        <w:tc>
+          <w:tcPr>
+            <w:tcW w:w="4508" w:type="dxa"/>
+          </w:tcPr>
+          <w:p>
+            <w:pPr>
+              <w:jc w:val="left"/>
+            </w:pPr>
+            <w:proofErr w:type="spellStart"/>
+            <w:r>
+              <w:t>uid</w:t>
+            </w:r>
+            <w:proofErr w:type="spellEnd"/>
+            <w:r>
+              <w:t xml:space="preserve">, </w:t>
+            </w:r>
+            <w:proofErr w:type="spellStart"/>
+            <w:r>
+              <w:t>displayName</w:t>
+            </w:r>
+            <w:proofErr w:type="spellEnd"/>
+            <w:r>
+              <w:t xml:space="preserve">, preferences, goals, </w:t>
+            </w:r>
+            <w:proofErr w:type="spellStart"/>
+            <w:r>
+              <w:t>preferredDurration</w:t>
+            </w:r>
+            <w:proofErr w:type="spellEnd"/>
+            <w:r>
+              <w:t xml:space="preserve">, </w:t>
+            </w:r>
+            <w:proofErr w:type="spellStart"/>
+            <w:r>
+              <w:t>createdAt</w:t>
+            </w:r>
+            <w:proofErr w:type="spellEnd"/>
+          </w:p>
+        </w:tc>
+      </w:tr>
+      <w:tr>
+        <w:tc>
+          <w:tcPr>
+            <w:tcW w:w="4508" w:type="dxa"/>
+          </w:tcPr>
+          <w:p>
+            <w:pPr>
+              <w:jc w:val="left"/>
+            </w:pPr>
+            <w:r>
+              <w:t>exercises</w:t>
+            </w:r>
+          </w:p>
+        </w:tc>
+        <w:tc>
+          <w:tcPr>
+            <w:tcW w:w="4508" w:type="dxa"/>
+          </w:tcPr>
+          <w:p>
+            <w:pPr>
+              <w:jc w:val="left"/>
+            </w:pPr>
+            <w:proofErr w:type="spellStart"/>
+            <w:r>
+              <w:t>exerciseId</w:t>
+            </w:r>
+            <w:proofErr w:type="spellEnd"/>
+            <w:r>
+              <w:t xml:space="preserve">, name, category, </w:t>
+            </w:r>
+            <w:proofErr w:type="spellStart"/>
+            <w:r>
+              <w:t>bodyRegions</w:t>
+            </w:r>
+            <w:proofErr w:type="spellEnd"/>
+            <w:r>
+              <w:t xml:space="preserve">, </w:t>
+            </w:r>
+            <w:proofErr w:type="spellStart"/>
+            <w:r>
+              <w:t>movementGoals</w:t>
+            </w:r>
+            <w:proofErr w:type="spellEnd"/>
+            <w:r>
+              <w:t xml:space="preserve">, difficulty, instructions, </w:t>
+            </w:r>
+            <w:proofErr w:type="spellStart"/>
+            <w:r>
+              <w:t>commonMistakes</w:t>
+            </w:r>
+            <w:proofErr w:type="spellEnd"/>
+            <w:r>
+              <w:t xml:space="preserve">, duration/reps, media, equipment, </w:t>
+            </w:r>
+            <w:proofErr w:type="spellStart"/>
+            <w:r>
+              <w:t>safetyNotes</w:t>
+            </w:r>
+            <w:proofErr w:type="spellEnd"/>
+          </w:p>
+        </w:tc>
+      </w:tr>
+      <w:tr>
+        <w:tc>
+          <w:tcPr>
+            <w:tcW w:w="4508" w:type="dxa"/>
+          </w:tcPr>
+          <w:p>
+            <w:pPr>
+              <w:jc w:val="left"/>
+            </w:pPr>
+            <w:r>
+              <w:t>Routines</w:t>
+            </w:r>
+          </w:p>
+        </w:tc>
+        <w:tc>
+          <w:tcPr>
+            <w:tcW w:w="4508" w:type="dxa"/>
+          </w:tcPr>
+          <w:p>
+            <w:pPr>
+              <w:jc w:val="left"/>
+            </w:pPr>
+            <w:proofErr w:type="spellStart"/>
+            <w:r>
+              <w:t>routineId</w:t>
+            </w:r>
+            <w:proofErr w:type="spellEnd"/>
+            <w:r>
+              <w:t xml:space="preserve">, title, description, duration, goals, </w:t>
+            </w:r>
+            <w:proofErr w:type="spellStart"/>
+            <w:r>
+              <w:t>bodyRegions</w:t>
+            </w:r>
+            <w:proofErr w:type="spellEnd"/>
+            <w:r>
+              <w:t xml:space="preserve">, </w:t>
+            </w:r>
+            <w:proofErr w:type="spellStart"/>
+            <w:r>
+              <w:t>situationTags</w:t>
+            </w:r>
+            <w:proofErr w:type="spellEnd"/>
+            <w:r>
+              <w:t>, difficulty, ordered exercise blocks</w:t>
+            </w:r>
+          </w:p>
+        </w:tc>
+      </w:tr>
+      <w:tr>
+        <w:tc>
+          <w:tcPr>
+            <w:tcW w:w="4508" w:type="dxa"/>
+          </w:tcPr>
+          <w:p>
+            <w:pPr>
+              <w:jc w:val="left"/>
+            </w:pPr>
+            <w:r>
+              <w:t>sessions</w:t>
+            </w:r>
+          </w:p>
+        </w:tc>
+        <w:tc>
+          <w:tcPr>
+            <w:tcW w:w="4508" w:type="dxa"/>
+          </w:tcPr>
+          <w:p>
+            <w:pPr>
+              <w:jc w:val="left"/>
+            </w:pPr>
+            <w:proofErr w:type="spellStart"/>
+            <w:r>
+              <w:t>sessionId</w:t>
+            </w:r>
+            <w:proofErr w:type="spellEnd"/>
+            <w:r>
+              <w:t xml:space="preserve">, </w:t>
+            </w:r>
+            <w:proofErr w:type="spellStart"/>
+            <w:r>
+              <w:t>userId</w:t>
+            </w:r>
+            <w:proofErr w:type="spellEnd"/>
+            <w:r>
+              <w:t xml:space="preserve">, </w:t>
+            </w:r>
+            <w:proofErr w:type="spellStart"/>
+            <w:r>
+              <w:t>routineId</w:t>
+            </w:r>
+            <w:proofErr w:type="spellEnd"/>
+            <w:r>
+              <w:t xml:space="preserve">, </w:t>
+            </w:r>
+            <w:proofErr w:type="spellStart"/>
+            <w:r>
+              <w:t>startedAt</w:t>
+            </w:r>
+            <w:proofErr w:type="spellEnd"/>
+            <w:r>
+              <w:t xml:space="preserve">, </w:t>
+            </w:r>
+            <w:proofErr w:type="spellStart"/>
+            <w:r>
+              <w:t>completedAt</w:t>
+            </w:r>
+            <w:proofErr w:type="spellEnd"/>
+            <w:r>
+              <w:t xml:space="preserve">, duration, </w:t>
+            </w:r>
+            <w:proofErr w:type="spellStart"/>
+            <w:r>
+              <w:t>completedExercises</w:t>
+            </w:r>
+            <w:proofErr w:type="spellEnd"/>
+            <w:r>
+              <w:t>, feedback</w:t>
+            </w:r>
+          </w:p>
+        </w:tc>
+      </w:tr>
+      <w:tr>
+        <w:tc>
+          <w:tcPr>
+            <w:tcW w:w="4508" w:type="dxa"/>
+          </w:tcPr>
+          <w:p>
+            <w:pPr>
+              <w:jc w:val="left"/>
+            </w:pPr>
+            <w:r>
+              <w:t>favourites</w:t>
+            </w:r>
+          </w:p>
+        </w:tc>
+        <w:tc>
+          <w:tcPr>
+            <w:tcW w:w="4508" w:type="dxa"/>
+          </w:tcPr>
+          <w:p>
+            <w:pPr>
+              <w:jc w:val="left"/>
+            </w:pPr>
+            <w:proofErr w:type="spellStart"/>
+            <w:r>
+              <w:t>userId</w:t>
+            </w:r>
+            <w:proofErr w:type="spellEnd"/>
+            <w:r>
+              <w:t xml:space="preserve"> + exercise/routine references</w:t>
+            </w:r>
+          </w:p>
+        </w:tc>
+      </w:tr>
+      <w:tr>
+        <w:tc>
+          <w:tcPr>
+            <w:tcW w:w="4508" w:type="dxa"/>
+          </w:tcPr>
+          <w:p>
+            <w:pPr>
+              <w:jc w:val="left"/>
+            </w:pPr>
+            <w:r>
+              <w:t>programmes</w:t>
+            </w:r>
+          </w:p>
+        </w:tc>
+        <w:tc>
+          <w:tcPr>
+            <w:tcW w:w="4508" w:type="dxa"/>
+          </w:tcPr>
+          <w:p>
+            <w:pPr>
+              <w:jc w:val="left"/>
+            </w:pPr>
+            <w:r>
+              <w:t xml:space="preserve">programmed, </w:t>
+            </w:r>
+            <w:proofErr w:type="spellStart"/>
+            <w:r>
+              <w:t>userId</w:t>
+            </w:r>
+            <w:proofErr w:type="spellEnd"/>
+            <w:r>
+              <w:t>, goals, schedule, routine references, current phase</w:t>
+            </w:r>
+          </w:p>
+        </w:tc>
+      </w:tr>
+      <w:tr>
+        <w:tc>
+          <w:tcPr>
+            <w:tcW w:w="4508" w:type="dxa"/>
+          </w:tcPr>
+          <w:p>
+            <w:pPr>
+              <w:jc w:val="left"/>
+            </w:pPr>
+            <w:proofErr w:type="spellStart"/>
+            <w:r>
+              <w:t>assessmentResults</w:t>
+            </w:r>
+            <w:proofErr w:type="spellEnd"/>
+          </w:p>
+        </w:tc>
+        <w:tc>
+          <w:tcPr>
+            <w:tcW w:w="4508" w:type="dxa"/>
+          </w:tcPr>
+          <w:p>
+            <w:pPr>
+              <w:jc w:val="left"/>
+            </w:pPr>
+            <w:proofErr w:type="spellStart"/>
+            <w:r>
+              <w:t>userId</w:t>
+            </w:r>
+            <w:proofErr w:type="spellEnd"/>
+            <w:r>
+              <w:t xml:space="preserve">, </w:t>
+            </w:r>
+            <w:proofErr w:type="spellStart"/>
+            <w:r>
+              <w:t>assessmentType</w:t>
+            </w:r>
+            <w:proofErr w:type="spellEnd"/>
+            <w:r>
+              <w:t>, measurement, unit, date, confidence/source</w:t>
+            </w:r>
+          </w:p>
+        </w:tc>
+      </w:tr>
+      <w:tr>
+        <w:tc>
+          <w:tcPr>
+            <w:tcW w:w="4508" w:type="dxa"/>
+          </w:tcPr>
+          <w:p>
+            <w:pPr>
+              <w:jc w:val="left"/>
+            </w:pPr>
+            <w:proofErr w:type="spellStart"/>
+            <w:r>
+              <w:t>recommendationEvents</w:t>
+            </w:r>
+            <w:proofErr w:type="spellEnd"/>
+          </w:p>
+        </w:tc>
+        <w:tc>
+          <w:tcPr>
+            <w:tcW w:w="4508" w:type="dxa"/>
+          </w:tcPr>
+          <w:p>
+            <w:pPr>
+              <w:jc w:val="left"/>
+            </w:pPr>
+            <w:r>
+              <w:t xml:space="preserve">inputs/rules used, recommended routine IDs, accepted/ignored result </w:t>
+            </w:r>
+          </w:p>
+        </w:tc>
+      </w:tr>
+    </w:tbl>
+    <w:p/>
+    <w:p>
+      <w:pPr>
+        <w:jc w:val="left"/>
+      </w:pPr>
+      <w:r>
+        <w:t>Exercise classification, e</w:t>
+      </w:r>
+      <w:r>
+        <w:t>ach exercise should be tagged so the system can find it by different user intents</w:t>
+      </w:r>
+      <w:r>
+        <w:t>:</w:t>
       </w:r>
     </w:p>
     <w:p>
       <w:pPr>
-        <w:pStyle w:val="Heading1"/>
-      </w:pPr>
-      <w:r>
-        <w:t>Personalisation, Recommendations &amp; Assessment</w:t>
+        <w:pStyle w:val="ListParagraph"/>
+        <w:numPr>
+          <w:ilvl w:val="0"/>
+          <w:numId w:val="24"/>
+        </w:numPr>
+        <w:jc w:val="left"/>
+      </w:pPr>
+      <w:r>
+        <w:t xml:space="preserve">Category: </w:t>
+      </w:r>
+      <w:r>
+        <w:t>static flexibility, dynamic flexibility, joint mobility, active mobility, stability/control, activation</w:t>
       </w:r>
     </w:p>
     <w:p>
       <w:pPr>
-        <w:pStyle w:val="Heading1"/>
-      </w:pPr>
-      <w:r>
-        <w:t>Development &amp; Implementation Best Practices</w:t>
+        <w:pStyle w:val="ListParagraph"/>
+        <w:numPr>
+          <w:ilvl w:val="0"/>
+          <w:numId w:val="24"/>
+        </w:numPr>
+        <w:jc w:val="left"/>
+      </w:pPr>
+      <w:r>
+        <w:t xml:space="preserve">Body region: </w:t>
+      </w:r>
+      <w:r>
+        <w:t>shoulders, thoracic spine, lumbar region, hips, knees, calves, ankles, wrists etc</w:t>
       </w:r>
     </w:p>
     <w:p>
       <w:pPr>
+        <w:pStyle w:val="ListParagraph"/>
+        <w:numPr>
+          <w:ilvl w:val="0"/>
+          <w:numId w:val="24"/>
+        </w:numPr>
+        <w:jc w:val="left"/>
+      </w:pPr>
+      <w:r>
+        <w:t>Movement/</w:t>
+      </w:r>
+      <w:r>
+        <w:t>G</w:t>
+      </w:r>
+      <w:r>
+        <w:t>oal tags: squat, overhead reach, running, martial arts, desk reset, warm-up, cooldown</w:t>
+      </w:r>
+    </w:p>
+    <w:p>
+      <w:pPr>
+        <w:pStyle w:val="ListParagraph"/>
+        <w:numPr>
+          <w:ilvl w:val="0"/>
+          <w:numId w:val="24"/>
+        </w:numPr>
+        <w:jc w:val="left"/>
+      </w:pPr>
+      <w:r>
+        <w:t>Difficulty and progression/regression relationships</w:t>
+      </w:r>
+    </w:p>
+    <w:p>
+      <w:pPr>
+        <w:pStyle w:val="ListParagraph"/>
+        <w:numPr>
+          <w:ilvl w:val="0"/>
+          <w:numId w:val="24"/>
+        </w:numPr>
+        <w:jc w:val="left"/>
+      </w:pPr>
+      <w:r>
+        <w:t>Equipment requirements and available alternatives</w:t>
+      </w:r>
+    </w:p>
+    <w:p>
+      <w:pPr>
+        <w:pStyle w:val="ListParagraph"/>
+        <w:numPr>
+          <w:ilvl w:val="0"/>
+          <w:numId w:val="24"/>
+        </w:numPr>
+        <w:jc w:val="left"/>
+      </w:pPr>
+      <w:r>
+        <w:t>Safety notes, stop conditions and contraindication flags where appropriate</w:t>
+      </w:r>
+    </w:p>
+    <w:p>
+      <w:pPr>
         <w:pStyle w:val="Heading1"/>
       </w:pPr>
       <w:r>
+        <w:t>Personalisation, Recommendations &amp; Assessment</w:t>
+      </w:r>
+    </w:p>
+    <w:p>
+      <w:pPr>
+        <w:pStyle w:val="Heading1"/>
+        <w:jc w:val="left"/>
+      </w:pPr>
+      <w:r>
+        <w:t>Development &amp; Implementation Best Practices</w:t>
+      </w:r>
+    </w:p>
+    <w:p/>
+    <w:p>
+      <w:pPr>
+        <w:pStyle w:val="Heading1"/>
+        <w:jc w:val="left"/>
+      </w:pPr>
+      <w:r>
+        <w:t xml:space="preserve">Example </w:t>
+      </w:r>
+      <w:r>
         <w:t>Testing Stragety</w:t>
+      </w:r>
+    </w:p>
+    <w:tbl>
+      <w:tblPr>
+        <w:tblStyle w:val="TableGrid"/>
+        <w:tblW w:w="0" w:type="auto"/>
+        <w:tblLook w:val="04A0" w:firstRow="1" w:lastRow="0" w:firstColumn="1" w:lastColumn="0" w:noHBand="0" w:noVBand="1"/>
+      </w:tblPr>
+      <w:tblGrid>
+        <w:gridCol w:w="3005"/>
+        <w:gridCol w:w="3005"/>
+        <w:gridCol w:w="3006"/>
+      </w:tblGrid>
+      <w:tr>
+        <w:tc>
+          <w:tcPr>
+            <w:tcW w:w="3005" w:type="dxa"/>
+            <w:tcBorders>
+              <w:top w:val="nil"/>
+              <w:left w:val="nil"/>
+            </w:tcBorders>
+          </w:tcPr>
+          <w:p>
+            <w:r>
+              <w:t>Test level</w:t>
+            </w:r>
+          </w:p>
+        </w:tc>
+        <w:tc>
+          <w:tcPr>
+            <w:tcW w:w="3005" w:type="dxa"/>
+            <w:tcBorders>
+              <w:top w:val="nil"/>
+            </w:tcBorders>
+          </w:tcPr>
+          <w:p>
+            <w:r>
+              <w:t>Examples</w:t>
+            </w:r>
+          </w:p>
+        </w:tc>
+        <w:tc>
+          <w:tcPr>
+            <w:tcW w:w="3006" w:type="dxa"/>
+            <w:tcBorders>
+              <w:top w:val="nil"/>
+              <w:right w:val="nil"/>
+            </w:tcBorders>
+          </w:tcPr>
+          <w:p>
+            <w:r>
+              <w:t>When</w:t>
+            </w:r>
+          </w:p>
+        </w:tc>
+      </w:tr>
+      <w:tr>
+        <w:tc>
+          <w:tcPr>
+            <w:tcW w:w="3005" w:type="dxa"/>
+          </w:tcPr>
+          <w:p>
+            <w:pPr>
+              <w:jc w:val="left"/>
+            </w:pPr>
+            <w:r>
+              <w:t>Unit test</w:t>
+            </w:r>
+          </w:p>
+        </w:tc>
+        <w:tc>
+          <w:tcPr>
+            <w:tcW w:w="3005" w:type="dxa"/>
+          </w:tcPr>
+          <w:p>
+            <w:pPr>
+              <w:jc w:val="left"/>
+            </w:pPr>
+            <w:r>
+              <w:t>Recommendation rules, timer logic, validation, mapping, repositories with mocks</w:t>
+            </w:r>
+          </w:p>
+        </w:tc>
+        <w:tc>
+          <w:tcPr>
+            <w:tcW w:w="3006" w:type="dxa"/>
+          </w:tcPr>
+          <w:p>
+            <w:pPr>
+              <w:jc w:val="left"/>
+            </w:pPr>
+            <w:r>
+              <w:t xml:space="preserve">Every </w:t>
+            </w:r>
+            <w:r>
+              <w:t>feature</w:t>
+            </w:r>
+          </w:p>
+        </w:tc>
+      </w:tr>
+      <w:tr>
+        <w:tc>
+          <w:tcPr>
+            <w:tcW w:w="3005" w:type="dxa"/>
+          </w:tcPr>
+          <w:p>
+            <w:pPr>
+              <w:jc w:val="left"/>
+            </w:pPr>
+            <w:r>
+              <w:t>Widget test</w:t>
+            </w:r>
+          </w:p>
+        </w:tc>
+        <w:tc>
+          <w:tcPr>
+            <w:tcW w:w="3005" w:type="dxa"/>
+          </w:tcPr>
+          <w:p>
+            <w:pPr>
+              <w:jc w:val="left"/>
+            </w:pPr>
+            <w:r>
+              <w:t>Routine cards, empty/error/loading states, session controls</w:t>
+            </w:r>
+          </w:p>
+        </w:tc>
+        <w:tc>
+          <w:tcPr>
+            <w:tcW w:w="3006" w:type="dxa"/>
+          </w:tcPr>
+          <w:p>
+            <w:pPr>
+              <w:jc w:val="left"/>
+            </w:pPr>
+            <w:r>
+              <w:t>Every important UI component/flow</w:t>
+            </w:r>
+          </w:p>
+        </w:tc>
+      </w:tr>
+      <w:tr>
+        <w:tc>
+          <w:tcPr>
+            <w:tcW w:w="3005" w:type="dxa"/>
+          </w:tcPr>
+          <w:p>
+            <w:pPr>
+              <w:jc w:val="left"/>
+            </w:pPr>
+            <w:r>
+              <w:t>Integration test</w:t>
+            </w:r>
+          </w:p>
+        </w:tc>
+        <w:tc>
+          <w:tcPr>
+            <w:tcW w:w="3005" w:type="dxa"/>
+          </w:tcPr>
+          <w:p>
+            <w:pPr>
+              <w:jc w:val="left"/>
+            </w:pPr>
+            <w:r>
+              <w:t>Explore -&gt; routine -&gt; session -&gt; completion; sign-in -&gt; history</w:t>
+            </w:r>
+          </w:p>
+        </w:tc>
+        <w:tc>
+          <w:tcPr>
+            <w:tcW w:w="3006" w:type="dxa"/>
+          </w:tcPr>
+          <w:p>
+            <w:pPr>
+              <w:jc w:val="left"/>
+            </w:pPr>
+            <w:r>
+              <w:t>Critical journeys before release</w:t>
+            </w:r>
+          </w:p>
+        </w:tc>
+      </w:tr>
+      <w:tr>
+        <w:tc>
+          <w:tcPr>
+            <w:tcW w:w="3005" w:type="dxa"/>
+          </w:tcPr>
+          <w:p>
+            <w:pPr>
+              <w:jc w:val="left"/>
+            </w:pPr>
+            <w:r>
+              <w:t>Firebase rules tests</w:t>
+            </w:r>
+          </w:p>
+        </w:tc>
+        <w:tc>
+          <w:tcPr>
+            <w:tcW w:w="3005" w:type="dxa"/>
+          </w:tcPr>
+          <w:p>
+            <w:pPr>
+              <w:jc w:val="left"/>
+            </w:pPr>
+            <w:r>
+              <w:t>User A cannot read/write User B data; permitted public catalogue reads</w:t>
+            </w:r>
+          </w:p>
+        </w:tc>
+        <w:tc>
+          <w:tcPr>
+            <w:tcW w:w="3006" w:type="dxa"/>
+          </w:tcPr>
+          <w:p>
+            <w:pPr>
+              <w:jc w:val="left"/>
+            </w:pPr>
+            <w:r>
+              <w:t>Whenever rules/data model change</w:t>
+            </w:r>
+          </w:p>
+        </w:tc>
+      </w:tr>
+      <w:tr>
+        <w:tc>
+          <w:tcPr>
+            <w:tcW w:w="3005" w:type="dxa"/>
+          </w:tcPr>
+          <w:p>
+            <w:pPr>
+              <w:jc w:val="left"/>
+            </w:pPr>
+            <w:r>
+              <w:t>Manual device tests</w:t>
+            </w:r>
+          </w:p>
+        </w:tc>
+        <w:tc>
+          <w:tcPr>
+            <w:tcW w:w="3005" w:type="dxa"/>
+          </w:tcPr>
+          <w:p>
+            <w:pPr>
+              <w:jc w:val="left"/>
+            </w:pPr>
+            <w:r>
+              <w:t>Background/Foreground, orientation, slow network, offline behaviour, different screen size</w:t>
+            </w:r>
+          </w:p>
+        </w:tc>
+        <w:tc>
+          <w:tcPr>
+            <w:tcW w:w="3006" w:type="dxa"/>
+          </w:tcPr>
+          <w:p>
+            <w:pPr>
+              <w:jc w:val="left"/>
+            </w:pPr>
+            <w:r>
+              <w:t>Before milestone/releases</w:t>
+            </w:r>
+          </w:p>
+        </w:tc>
+      </w:tr>
+      <w:tr>
+        <w:tc>
+          <w:tcPr>
+            <w:tcW w:w="3005" w:type="dxa"/>
+          </w:tcPr>
+          <w:p>
+            <w:pPr>
+              <w:jc w:val="left"/>
+            </w:pPr>
+            <w:r>
+              <w:t>Usability tests</w:t>
+            </w:r>
+          </w:p>
+        </w:tc>
+        <w:tc>
+          <w:tcPr>
+            <w:tcW w:w="3005" w:type="dxa"/>
+          </w:tcPr>
+          <w:p>
+            <w:pPr>
+              <w:jc w:val="left"/>
+            </w:pPr>
+            <w:r>
+              <w:t>Can a new user fine a routine without explanation? Can they use controls while exercising?</w:t>
+            </w:r>
+          </w:p>
+        </w:tc>
+        <w:tc>
+          <w:tcPr>
+            <w:tcW w:w="3006" w:type="dxa"/>
+          </w:tcPr>
+          <w:p>
+            <w:pPr>
+              <w:jc w:val="left"/>
+            </w:pPr>
+            <w:r>
+              <w:t>Prototype + pre-release</w:t>
+            </w:r>
+          </w:p>
+        </w:tc>
+      </w:tr>
+      <w:tr>
+        <w:tc>
+          <w:tcPr>
+            <w:tcW w:w="3005" w:type="dxa"/>
+          </w:tcPr>
+          <w:p>
+            <w:pPr>
+              <w:jc w:val="left"/>
+            </w:pPr>
+            <w:r>
+              <w:t>Accessibility checks</w:t>
+            </w:r>
+          </w:p>
+        </w:tc>
+        <w:tc>
+          <w:tcPr>
+            <w:tcW w:w="3005" w:type="dxa"/>
+          </w:tcPr>
+          <w:p>
+            <w:pPr>
+              <w:jc w:val="left"/>
+            </w:pPr>
+            <w:r>
+              <w:t>Text scaling, contrast, labels, keyboard/focus where relevant, touch targets</w:t>
+            </w:r>
+          </w:p>
+        </w:tc>
+        <w:tc>
+          <w:tcPr>
+            <w:tcW w:w="3006" w:type="dxa"/>
+          </w:tcPr>
+          <w:p>
+            <w:pPr>
+              <w:jc w:val="left"/>
+            </w:pPr>
+            <w:r>
+              <w:t>Throughout</w:t>
+            </w:r>
+          </w:p>
+        </w:tc>
+      </w:tr>
+    </w:tbl>
+    <w:p>
+      <w:pPr>
+        <w:jc w:val="left"/>
+      </w:pPr>
+    </w:p>
+    <w:p>
+      <w:pPr>
+        <w:jc w:val="left"/>
+      </w:pPr>
+      <w:r>
+        <w:t>Definition of a DONE feature:</w:t>
+      </w:r>
+    </w:p>
+    <w:p>
+      <w:pPr>
+        <w:pStyle w:val="ListParagraph"/>
+        <w:numPr>
+          <w:ilvl w:val="0"/>
+          <w:numId w:val="23"/>
+        </w:numPr>
+        <w:jc w:val="left"/>
+      </w:pPr>
+      <w:r>
+        <w:t>Loading, empty and failure states are handled</w:t>
+      </w:r>
+    </w:p>
+    <w:p>
+      <w:pPr>
+        <w:pStyle w:val="ListParagraph"/>
+        <w:numPr>
+          <w:ilvl w:val="0"/>
+          <w:numId w:val="23"/>
+        </w:numPr>
+        <w:jc w:val="left"/>
+      </w:pPr>
+      <w:r>
+        <w:t>Unit/Widget tests over important logic and/or UI behaviour</w:t>
+      </w:r>
+    </w:p>
+    <w:p>
+      <w:pPr>
+        <w:pStyle w:val="ListParagraph"/>
+        <w:numPr>
+          <w:ilvl w:val="0"/>
+          <w:numId w:val="23"/>
+        </w:numPr>
+        <w:jc w:val="left"/>
+      </w:pPr>
+      <w:r>
+        <w:t>Analytic events are added if necessary/ideal</w:t>
+      </w:r>
+    </w:p>
+    <w:p>
+      <w:pPr>
+        <w:pStyle w:val="ListParagraph"/>
+        <w:numPr>
+          <w:ilvl w:val="0"/>
+          <w:numId w:val="23"/>
+        </w:numPr>
+        <w:jc w:val="left"/>
+      </w:pPr>
+      <w:r>
+        <w:t>Accessibility and responsive layout are checked</w:t>
+      </w:r>
+    </w:p>
+    <w:p>
+      <w:pPr>
+        <w:pStyle w:val="ListParagraph"/>
+        <w:numPr>
+          <w:ilvl w:val="0"/>
+          <w:numId w:val="23"/>
+        </w:numPr>
+        <w:jc w:val="left"/>
+      </w:pPr>
+      <w:r>
+        <w:t>No warnings</w:t>
+      </w:r>
+    </w:p>
+    <w:p>
+      <w:pPr>
+        <w:pStyle w:val="ListParagraph"/>
+        <w:numPr>
+          <w:ilvl w:val="0"/>
+          <w:numId w:val="23"/>
+        </w:numPr>
+        <w:jc w:val="left"/>
+      </w:pPr>
+      <w:r>
+        <w:t>Documentation/Decision notes are made and/or updated</w:t>
       </w:r>
     </w:p>
     <w:p>
@@ -2299,6 +3276,92 @@
     </w:lvl>
   </w:abstractNum>
   <w:abstractNum w:abstractNumId="1" w15:restartNumberingAfterBreak="0">
+    <w:nsid w:val="28404928"/>
+    <w:multiLevelType w:val="hybridMultilevel"/>
+    <w:tmpl w:val="B5448D84"/>
+    <w:lvl w:ilvl="0" w:tplc="0809000F">
+      <w:start w:val="1"/>
+      <w:numFmt w:val="decimal"/>
+      <w:lvlText w:val="%1."/>
+      <w:lvlJc w:val="left"/>
+      <w:pPr>
+        <w:ind w:left="720" w:hanging="360"/>
+      </w:pPr>
+    </w:lvl>
+    <w:lvl w:ilvl="1" w:tplc="08090019" w:tentative="1">
+      <w:start w:val="1"/>
+      <w:numFmt w:val="lowerLetter"/>
+      <w:lvlText w:val="%2."/>
+      <w:lvlJc w:val="left"/>
+      <w:pPr>
+        <w:ind w:left="1440" w:hanging="360"/>
+      </w:pPr>
+    </w:lvl>
+    <w:lvl w:ilvl="2" w:tplc="0809001B" w:tentative="1">
+      <w:start w:val="1"/>
+      <w:numFmt w:val="lowerRoman"/>
+      <w:lvlText w:val="%3."/>
+      <w:lvlJc w:val="right"/>
+      <w:pPr>
+        <w:ind w:left="2160" w:hanging="180"/>
+      </w:pPr>
+    </w:lvl>
+    <w:lvl w:ilvl="3" w:tplc="0809000F" w:tentative="1">
+      <w:start w:val="1"/>
+      <w:numFmt w:val="decimal"/>
+      <w:lvlText w:val="%4."/>
+      <w:lvlJc w:val="left"/>
+      <w:pPr>
+        <w:ind w:left="2880" w:hanging="360"/>
+      </w:pPr>
+    </w:lvl>
+    <w:lvl w:ilvl="4" w:tplc="08090019" w:tentative="1">
+      <w:start w:val="1"/>
+      <w:numFmt w:val="lowerLetter"/>
+      <w:lvlText w:val="%5."/>
+      <w:lvlJc w:val="left"/>
+      <w:pPr>
+        <w:ind w:left="3600" w:hanging="360"/>
+      </w:pPr>
+    </w:lvl>
+    <w:lvl w:ilvl="5" w:tplc="0809001B" w:tentative="1">
+      <w:start w:val="1"/>
+      <w:numFmt w:val="lowerRoman"/>
+      <w:lvlText w:val="%6."/>
+      <w:lvlJc w:val="right"/>
+      <w:pPr>
+        <w:ind w:left="4320" w:hanging="180"/>
+      </w:pPr>
+    </w:lvl>
+    <w:lvl w:ilvl="6" w:tplc="0809000F" w:tentative="1">
+      <w:start w:val="1"/>
+      <w:numFmt w:val="decimal"/>
+      <w:lvlText w:val="%7."/>
+      <w:lvlJc w:val="left"/>
+      <w:pPr>
+        <w:ind w:left="5040" w:hanging="360"/>
+      </w:pPr>
+    </w:lvl>
+    <w:lvl w:ilvl="7" w:tplc="08090019" w:tentative="1">
+      <w:start w:val="1"/>
+      <w:numFmt w:val="lowerLetter"/>
+      <w:lvlText w:val="%8."/>
+      <w:lvlJc w:val="left"/>
+      <w:pPr>
+        <w:ind w:left="5760" w:hanging="360"/>
+      </w:pPr>
+    </w:lvl>
+    <w:lvl w:ilvl="8" w:tplc="0809001B" w:tentative="1">
+      <w:start w:val="1"/>
+      <w:numFmt w:val="lowerRoman"/>
+      <w:lvlText w:val="%9."/>
+      <w:lvlJc w:val="right"/>
+      <w:pPr>
+        <w:ind w:left="6480" w:hanging="180"/>
+      </w:pPr>
+    </w:lvl>
+  </w:abstractNum>
+  <w:abstractNum w:abstractNumId="2" w15:restartNumberingAfterBreak="0">
     <w:nsid w:val="37660336"/>
     <w:multiLevelType w:val="hybridMultilevel"/>
     <w:tmpl w:val="754EAC84"/>
@@ -2439,7 +3502,120 @@
       </w:rPr>
     </w:lvl>
   </w:abstractNum>
-  <w:abstractNum w:abstractNumId="2" w15:restartNumberingAfterBreak="0">
+  <w:abstractNum w:abstractNumId="3" w15:restartNumberingAfterBreak="0">
+    <w:nsid w:val="3C6E1960"/>
+    <w:multiLevelType w:val="hybridMultilevel"/>
+    <w:tmpl w:val="62445D02"/>
+    <w:lvl w:ilvl="0" w:tplc="08090001">
+      <w:start w:val="1"/>
+      <w:numFmt w:val="bullet"/>
+      <w:lvlText w:val=""/>
+      <w:lvlJc w:val="left"/>
+      <w:pPr>
+        <w:ind w:left="720" w:hanging="360"/>
+      </w:pPr>
+      <w:rPr>
+        <w:rFonts w:ascii="Symbol" w:hAnsi="Symbol" w:hint="default"/>
+      </w:rPr>
+    </w:lvl>
+    <w:lvl w:ilvl="1" w:tplc="08090003" w:tentative="1">
+      <w:start w:val="1"/>
+      <w:numFmt w:val="bullet"/>
+      <w:lvlText w:val="o"/>
+      <w:lvlJc w:val="left"/>
+      <w:pPr>
+        <w:ind w:left="1440" w:hanging="360"/>
+      </w:pPr>
+      <w:rPr>
+        <w:rFonts w:ascii="Courier New" w:hAnsi="Courier New" w:cs="Courier New" w:hint="default"/>
+      </w:rPr>
+    </w:lvl>
+    <w:lvl w:ilvl="2" w:tplc="08090005" w:tentative="1">
+      <w:start w:val="1"/>
+      <w:numFmt w:val="bullet"/>
+      <w:lvlText w:val=""/>
+      <w:lvlJc w:val="left"/>
+      <w:pPr>
+        <w:ind w:left="2160" w:hanging="360"/>
+      </w:pPr>
+      <w:rPr>
+        <w:rFonts w:ascii="Wingdings" w:hAnsi="Wingdings" w:hint="default"/>
+      </w:rPr>
+    </w:lvl>
+    <w:lvl w:ilvl="3" w:tplc="08090001" w:tentative="1">
+      <w:start w:val="1"/>
+      <w:numFmt w:val="bullet"/>
+      <w:lvlText w:val=""/>
+      <w:lvlJc w:val="left"/>
+      <w:pPr>
+        <w:ind w:left="2880" w:hanging="360"/>
+      </w:pPr>
+      <w:rPr>
+        <w:rFonts w:ascii="Symbol" w:hAnsi="Symbol" w:hint="default"/>
+      </w:rPr>
+    </w:lvl>
+    <w:lvl w:ilvl="4" w:tplc="08090003" w:tentative="1">
+      <w:start w:val="1"/>
+      <w:numFmt w:val="bullet"/>
+      <w:lvlText w:val="o"/>
+      <w:lvlJc w:val="left"/>
+      <w:pPr>
+        <w:ind w:left="3600" w:hanging="360"/>
+      </w:pPr>
+      <w:rPr>
+        <w:rFonts w:ascii="Courier New" w:hAnsi="Courier New" w:cs="Courier New" w:hint="default"/>
+      </w:rPr>
+    </w:lvl>
+    <w:lvl w:ilvl="5" w:tplc="08090005" w:tentative="1">
+      <w:start w:val="1"/>
+      <w:numFmt w:val="bullet"/>
+      <w:lvlText w:val=""/>
+      <w:lvlJc w:val="left"/>
+      <w:pPr>
+        <w:ind w:left="4320" w:hanging="360"/>
+      </w:pPr>
+      <w:rPr>
+        <w:rFonts w:ascii="Wingdings" w:hAnsi="Wingdings" w:hint="default"/>
+      </w:rPr>
+    </w:lvl>
+    <w:lvl w:ilvl="6" w:tplc="08090001" w:tentative="1">
+      <w:start w:val="1"/>
+      <w:numFmt w:val="bullet"/>
+      <w:lvlText w:val=""/>
+      <w:lvlJc w:val="left"/>
+      <w:pPr>
+        <w:ind w:left="5040" w:hanging="360"/>
+      </w:pPr>
+      <w:rPr>
+        <w:rFonts w:ascii="Symbol" w:hAnsi="Symbol" w:hint="default"/>
+      </w:rPr>
+    </w:lvl>
+    <w:lvl w:ilvl="7" w:tplc="08090003" w:tentative="1">
+      <w:start w:val="1"/>
+      <w:numFmt w:val="bullet"/>
+      <w:lvlText w:val="o"/>
+      <w:lvlJc w:val="left"/>
+      <w:pPr>
+        <w:ind w:left="5760" w:hanging="360"/>
+      </w:pPr>
+      <w:rPr>
+        <w:rFonts w:ascii="Courier New" w:hAnsi="Courier New" w:cs="Courier New" w:hint="default"/>
+      </w:rPr>
+    </w:lvl>
+    <w:lvl w:ilvl="8" w:tplc="08090005" w:tentative="1">
+      <w:start w:val="1"/>
+      <w:numFmt w:val="bullet"/>
+      <w:lvlText w:val=""/>
+      <w:lvlJc w:val="left"/>
+      <w:pPr>
+        <w:ind w:left="6480" w:hanging="360"/>
+      </w:pPr>
+      <w:rPr>
+        <w:rFonts w:ascii="Wingdings" w:hAnsi="Wingdings" w:hint="default"/>
+      </w:rPr>
+    </w:lvl>
+  </w:abstractNum>
+  <w:abstractNum w:abstractNumId="4" w15:restartNumberingAfterBreak="0">
     <w:nsid w:val="4189603E"/>
     <w:multiLevelType w:val="multilevel"/>
     <w:tmpl w:val="99F02C08"/>
@@ -2646,7 +3822,7 @@
       </w:rPr>
     </w:lvl>
   </w:abstractNum>
-  <w:abstractNum w:abstractNumId="3" w15:restartNumberingAfterBreak="0">
+  <w:abstractNum w:abstractNumId="5" w15:restartNumberingAfterBreak="0">
     <w:nsid w:val="493C3F76"/>
     <w:multiLevelType w:val="hybridMultilevel"/>
     <w:tmpl w:val="9A9E418C"/>
@@ -2757,7 +3933,7 @@
       </w:pPr>
     </w:lvl>
   </w:abstractNum>
-  <w:abstractNum w:abstractNumId="4" w15:restartNumberingAfterBreak="0">
+  <w:abstractNum w:abstractNumId="6" w15:restartNumberingAfterBreak="0">
     <w:nsid w:val="52CA544A"/>
     <w:multiLevelType w:val="singleLevel"/>
     <w:tmpl w:val="AED6D67E"/>
@@ -2784,7 +3960,7 @@
       </w:rPr>
     </w:lvl>
   </w:abstractNum>
-  <w:abstractNum w:abstractNumId="5" w15:restartNumberingAfterBreak="0">
+  <w:abstractNum w:abstractNumId="7" w15:restartNumberingAfterBreak="0">
     <w:nsid w:val="599B5E67"/>
     <w:multiLevelType w:val="hybridMultilevel"/>
     <w:tmpl w:val="B1A495C2"/>
@@ -2897,7 +4073,7 @@
       </w:rPr>
     </w:lvl>
   </w:abstractNum>
-  <w:abstractNum w:abstractNumId="6" w15:restartNumberingAfterBreak="0">
+  <w:abstractNum w:abstractNumId="8" w15:restartNumberingAfterBreak="0">
     <w:nsid w:val="6C402C58"/>
     <w:multiLevelType w:val="hybridMultilevel"/>
     <w:tmpl w:val="20EED364"/>
@@ -3042,7 +4218,7 @@
       </w:rPr>
     </w:lvl>
   </w:abstractNum>
-  <w:abstractNum w:abstractNumId="7" w15:restartNumberingAfterBreak="0">
+  <w:abstractNum w:abstractNumId="9" w15:restartNumberingAfterBreak="0">
     <w:nsid w:val="6CD32DA8"/>
     <w:multiLevelType w:val="singleLevel"/>
     <w:tmpl w:val="166470C2"/>
@@ -3068,7 +4244,7 @@
       </w:rPr>
     </w:lvl>
   </w:abstractNum>
-  <w:abstractNum w:abstractNumId="8" w15:restartNumberingAfterBreak="0">
+  <w:abstractNum w:abstractNumId="10" w15:restartNumberingAfterBreak="0">
     <w:nsid w:val="7283502C"/>
     <w:multiLevelType w:val="hybridMultilevel"/>
     <w:tmpl w:val="AA9A7D5C"/>
@@ -3158,70 +4334,76 @@
     </w:lvl>
   </w:abstractNum>
   <w:num w:numId="1" w16cid:durableId="1508641836">
-    <w:abstractNumId w:val="1"/>
+    <w:abstractNumId w:val="2"/>
   </w:num>
   <w:num w:numId="2" w16cid:durableId="571430521">
-    <w:abstractNumId w:val="6"/>
+    <w:abstractNumId w:val="8"/>
   </w:num>
   <w:num w:numId="3" w16cid:durableId="631979495">
     <w:abstractNumId w:val="0"/>
   </w:num>
   <w:num w:numId="4" w16cid:durableId="2026637807">
+    <w:abstractNumId w:val="4"/>
+  </w:num>
+  <w:num w:numId="5" w16cid:durableId="1416515667">
+    <w:abstractNumId w:val="4"/>
+  </w:num>
+  <w:num w:numId="6" w16cid:durableId="1186404399">
+    <w:abstractNumId w:val="4"/>
+  </w:num>
+  <w:num w:numId="7" w16cid:durableId="1687362260">
+    <w:abstractNumId w:val="4"/>
+  </w:num>
+  <w:num w:numId="8" w16cid:durableId="464740036">
+    <w:abstractNumId w:val="6"/>
+  </w:num>
+  <w:num w:numId="9" w16cid:durableId="1108159873">
+    <w:abstractNumId w:val="5"/>
+  </w:num>
+  <w:num w:numId="10" w16cid:durableId="1611887336">
+    <w:abstractNumId w:val="9"/>
+  </w:num>
+  <w:num w:numId="11" w16cid:durableId="769787036">
     <w:abstractNumId w:val="2"/>
   </w:num>
-  <w:num w:numId="5" w16cid:durableId="1416515667">
-    <w:abstractNumId w:val="2"/>
-  </w:num>
-  <w:num w:numId="6" w16cid:durableId="1186404399">
-    <w:abstractNumId w:val="2"/>
-  </w:num>
-  <w:num w:numId="7" w16cid:durableId="1687362260">
-    <w:abstractNumId w:val="2"/>
-  </w:num>
-  <w:num w:numId="8" w16cid:durableId="464740036">
-    <w:abstractNumId w:val="4"/>
-  </w:num>
-  <w:num w:numId="9" w16cid:durableId="1108159873">
-    <w:abstractNumId w:val="3"/>
-  </w:num>
-  <w:num w:numId="10" w16cid:durableId="1611887336">
-    <w:abstractNumId w:val="7"/>
-  </w:num>
-  <w:num w:numId="11" w16cid:durableId="769787036">
-    <w:abstractNumId w:val="1"/>
-  </w:num>
   <w:num w:numId="12" w16cid:durableId="2040276210">
-    <w:abstractNumId w:val="6"/>
+    <w:abstractNumId w:val="8"/>
   </w:num>
   <w:num w:numId="13" w16cid:durableId="662901109">
     <w:abstractNumId w:val="0"/>
   </w:num>
   <w:num w:numId="14" w16cid:durableId="1544516648">
-    <w:abstractNumId w:val="2"/>
+    <w:abstractNumId w:val="4"/>
   </w:num>
   <w:num w:numId="15" w16cid:durableId="306790346">
-    <w:abstractNumId w:val="2"/>
+    <w:abstractNumId w:val="4"/>
   </w:num>
   <w:num w:numId="16" w16cid:durableId="532547054">
-    <w:abstractNumId w:val="2"/>
+    <w:abstractNumId w:val="4"/>
   </w:num>
   <w:num w:numId="17" w16cid:durableId="1754431024">
-    <w:abstractNumId w:val="2"/>
+    <w:abstractNumId w:val="4"/>
   </w:num>
   <w:num w:numId="18" w16cid:durableId="1238901652">
-    <w:abstractNumId w:val="4"/>
+    <w:abstractNumId w:val="6"/>
   </w:num>
   <w:num w:numId="19" w16cid:durableId="317732974">
-    <w:abstractNumId w:val="3"/>
+    <w:abstractNumId w:val="5"/>
   </w:num>
   <w:num w:numId="20" w16cid:durableId="179927653">
+    <w:abstractNumId w:val="9"/>
+  </w:num>
+  <w:num w:numId="21" w16cid:durableId="1676804477">
     <w:abstractNumId w:val="7"/>
   </w:num>
-  <w:num w:numId="21" w16cid:durableId="1676804477">
-    <w:abstractNumId w:val="5"/>
+  <w:num w:numId="22" w16cid:durableId="1373731249">
+    <w:abstractNumId w:val="10"/>
   </w:num>
-  <w:num w:numId="22" w16cid:durableId="1373731249">
-    <w:abstractNumId w:val="8"/>
+  <w:num w:numId="23" w16cid:durableId="40330871">
+    <w:abstractNumId w:val="1"/>
+  </w:num>
+  <w:num w:numId="24" w16cid:durableId="1365982002">
+    <w:abstractNumId w:val="3"/>
   </w:num>
 </w:numbering>
 </file>
@@ -3843,7 +5025,6 @@
   <w:style w:type="character" w:default="1" w:styleId="DefaultParagraphFont">
     <w:name w:val="Default Paragraph Font"/>
     <w:uiPriority w:val="1"/>
-    <w:semiHidden/>
     <w:unhideWhenUsed/>
   </w:style>
   <w:style w:type="table" w:default="1" w:styleId="TableNormal">

</xml_diff>